<commit_message>
Updated folder navigation etc. to reduce student errors
</commit_message>
<xml_diff>
--- a/Practical0_schedule.docx
+++ b/Practical0_schedule.docx
@@ -77,7 +77,7 @@
             </w:rPr>
             <w:fldChar w:fldCharType="separate"/>
           </w:r>
-          <w:hyperlink w:anchor="__RefHeading___Toc2881_1119107993">
+          <w:hyperlink w:anchor="__RefHeading___Toc2883_2767856350">
             <w:r>
               <w:rPr>
                 <w:webHidden/>
@@ -98,7 +98,7 @@
             </w:tabs>
             <w:rPr/>
           </w:pPr>
-          <w:hyperlink w:anchor="__RefHeading___Toc2883_1119107993">
+          <w:hyperlink w:anchor="__RefHeading___Toc2885_2767856350">
             <w:r>
               <w:rPr>
                 <w:webHidden/>
@@ -119,7 +119,7 @@
             </w:tabs>
             <w:rPr/>
           </w:pPr>
-          <w:hyperlink w:anchor="__RefHeading___Toc2885_1119107993">
+          <w:hyperlink w:anchor="__RefHeading___Toc2887_2767856350">
             <w:r>
               <w:rPr>
                 <w:webHidden/>
@@ -140,7 +140,7 @@
             </w:tabs>
             <w:rPr/>
           </w:pPr>
-          <w:hyperlink w:anchor="__RefHeading___Toc2887_1119107993">
+          <w:hyperlink w:anchor="__RefHeading___Toc2889_2767856350">
             <w:r>
               <w:rPr>
                 <w:webHidden/>
@@ -161,7 +161,7 @@
             </w:tabs>
             <w:rPr/>
           </w:pPr>
-          <w:hyperlink w:anchor="__RefHeading___Toc2889_1119107993">
+          <w:hyperlink w:anchor="__RefHeading___Toc2891_2767856350">
             <w:r>
               <w:rPr>
                 <w:webHidden/>
@@ -182,7 +182,7 @@
             </w:tabs>
             <w:rPr/>
           </w:pPr>
-          <w:hyperlink w:anchor="__RefHeading___Toc2891_1119107993">
+          <w:hyperlink w:anchor="__RefHeading___Toc2893_2767856350">
             <w:r>
               <w:rPr>
                 <w:webHidden/>
@@ -203,7 +203,7 @@
             </w:tabs>
             <w:rPr/>
           </w:pPr>
-          <w:hyperlink w:anchor="__RefHeading___Toc2893_1119107993">
+          <w:hyperlink w:anchor="__RefHeading___Toc2895_2767856350">
             <w:r>
               <w:rPr>
                 <w:webHidden/>
@@ -211,7 +211,7 @@
               </w:rPr>
               <w:t>7. Working with data</w:t>
               <w:tab/>
-              <w:t>22</w:t>
+              <w:t>23</w:t>
             </w:r>
           </w:hyperlink>
         </w:p>
@@ -224,7 +224,7 @@
             </w:tabs>
             <w:rPr/>
           </w:pPr>
-          <w:hyperlink w:anchor="__RefHeading___Toc2895_1119107993">
+          <w:hyperlink w:anchor="__RefHeading___Toc2897_2767856350">
             <w:r>
               <w:rPr>
                 <w:webHidden/>
@@ -245,7 +245,7 @@
             </w:tabs>
             <w:rPr/>
           </w:pPr>
-          <w:hyperlink w:anchor="__RefHeading___Toc2897_1119107993">
+          <w:hyperlink w:anchor="__RefHeading___Toc2899_2767856350">
             <w:r>
               <w:rPr>
                 <w:webHidden/>
@@ -266,7 +266,7 @@
             </w:tabs>
             <w:rPr/>
           </w:pPr>
-          <w:hyperlink w:anchor="__RefHeading___Toc2899_1119107993">
+          <w:hyperlink w:anchor="__RefHeading___Toc2901_2767856350">
             <w:r>
               <w:rPr>
                 <w:webHidden/>
@@ -287,7 +287,7 @@
             </w:tabs>
             <w:rPr/>
           </w:pPr>
-          <w:hyperlink w:anchor="__RefHeading___Toc2901_1119107993">
+          <w:hyperlink w:anchor="__RefHeading___Toc2903_2767856350">
             <w:r>
               <w:rPr>
                 <w:webHidden/>
@@ -308,7 +308,7 @@
             </w:tabs>
             <w:rPr/>
           </w:pPr>
-          <w:hyperlink w:anchor="__RefHeading___Toc2903_1119107993">
+          <w:hyperlink w:anchor="__RefHeading___Toc2905_2767856350">
             <w:r>
               <w:rPr>
                 <w:webHidden/>
@@ -316,7 +316,7 @@
               </w:rPr>
               <w:t>12. In your own time</w:t>
               <w:tab/>
-              <w:t>36</w:t>
+              <w:t>37</w:t>
             </w:r>
           </w:hyperlink>
           <w:r>
@@ -343,7 +343,7 @@
         <w:pStyle w:val="Heading1"/>
         <w:rPr/>
       </w:pPr>
-      <w:bookmarkStart w:id="0" w:name="__RefHeading___Toc2881_1119107993"/>
+      <w:bookmarkStart w:id="0" w:name="__RefHeading___Toc2883_2767856350"/>
       <w:bookmarkStart w:id="1" w:name="learning-objectives"/>
       <w:bookmarkEnd w:id="0"/>
       <w:r>
@@ -707,7 +707,7 @@
         <w:pStyle w:val="Heading1"/>
         <w:rPr/>
       </w:pPr>
-      <w:bookmarkStart w:id="7" w:name="__RefHeading___Toc2883_1119107993"/>
+      <w:bookmarkStart w:id="7" w:name="__RefHeading___Toc2885_2767856350"/>
       <w:bookmarkStart w:id="8" w:name="modify-rstudio-default-settings"/>
       <w:bookmarkEnd w:id="7"/>
       <w:r>
@@ -1134,7 +1134,7 @@
         <w:pStyle w:val="Heading1"/>
         <w:rPr/>
       </w:pPr>
-      <w:bookmarkStart w:id="12" w:name="__RefHeading___Toc2885_1119107993"/>
+      <w:bookmarkStart w:id="12" w:name="__RefHeading___Toc2887_2767856350"/>
       <w:bookmarkStart w:id="13" w:name="r-packages"/>
       <w:bookmarkEnd w:id="12"/>
       <w:r>
@@ -1844,7 +1844,18 @@
       </w:r>
       <w:r>
         <w:rPr/>
-        <w:t xml:space="preserve"> command followed by the package name, for exampe (you don’t need to do this now):</w:t>
+        <w:t xml:space="preserve"> command followed by the package name, for example as follows </w:t>
+      </w:r>
+      <w:r>
+        <w:rPr>
+          <w:b/>
+          <w:bCs/>
+        </w:rPr>
+        <w:t>do not type the following yet</w:t>
+      </w:r>
+      <w:r>
+        <w:rPr/>
+        <w:t>:</w:t>
       </w:r>
     </w:p>
     <w:p>
@@ -1904,7 +1915,7 @@
         <w:pStyle w:val="Heading1"/>
         <w:rPr/>
       </w:pPr>
-      <w:bookmarkStart w:id="18" w:name="__RefHeading___Toc2887_1119107993"/>
+      <w:bookmarkStart w:id="18" w:name="__RefHeading___Toc2889_2767856350"/>
       <w:bookmarkStart w:id="19" w:name="rstudio-projects"/>
       <w:bookmarkEnd w:id="18"/>
       <w:r>
@@ -2135,7 +2146,7 @@
         <w:rPr/>
         <w:drawing>
           <wp:inline distT="0" distB="0" distL="0" distR="0">
-            <wp:extent cx="5334000" cy="3775075"/>
+            <wp:extent cx="5334000" cy="3825875"/>
             <wp:effectExtent l="0" t="0" r="0" b="0"/>
             <wp:docPr id="9" name="Image9" descr=""/>
             <wp:cNvGraphicFramePr>
@@ -2159,7 +2170,7 @@
                   <pic:spPr bwMode="auto">
                     <a:xfrm>
                       <a:off x="0" y="0"/>
-                      <a:ext cx="5334000" cy="3775075"/>
+                      <a:ext cx="5334000" cy="3825875"/>
                     </a:xfrm>
                     <a:prstGeom prst="rect">
                       <a:avLst/>
@@ -2365,7 +2376,7 @@
         <w:pStyle w:val="Heading1"/>
         <w:rPr/>
       </w:pPr>
-      <w:bookmarkStart w:id="22" w:name="__RefHeading___Toc2889_1119107993"/>
+      <w:bookmarkStart w:id="22" w:name="__RefHeading___Toc2891_2767856350"/>
       <w:bookmarkStart w:id="23" w:name="navigating-rstudio"/>
       <w:bookmarkEnd w:id="22"/>
       <w:r>
@@ -2380,37 +2391,30 @@
       </w:pPr>
       <w:r>
         <w:rPr/>
-        <w:t xml:space="preserve">In the top left click </w:t>
-      </w:r>
-      <w:r>
-        <w:rPr>
-          <w:rStyle w:val="VerbatimChar"/>
-        </w:rPr>
-        <w:t>file</w:t>
-      </w:r>
-      <w:r>
-        <w:rPr/>
-        <w:t xml:space="preserve"> &gt; </w:t>
-      </w:r>
-      <w:r>
-        <w:rPr>
-          <w:rStyle w:val="VerbatimChar"/>
-        </w:rPr>
-        <w:t>new file</w:t>
-      </w:r>
-      <w:r>
-        <w:rPr/>
-        <w:t xml:space="preserve"> &gt; </w:t>
-      </w:r>
-      <w:r>
-        <w:rPr>
-          <w:rStyle w:val="VerbatimChar"/>
-        </w:rPr>
-        <w:t>R script</w:t>
-      </w:r>
-      <w:r>
-        <w:rPr/>
-        <w:t xml:space="preserve"> and now you should have four windows that look something like this:</w:t>
+        <w:t>In the top left click:</w:t>
+      </w:r>
+    </w:p>
+    <w:p>
+      <w:pPr>
+        <w:pStyle w:val="BodyText"/>
+        <w:rPr/>
+      </w:pPr>
+      <w:r>
+        <w:rPr>
+          <w:b/>
+          <w:bCs/>
+        </w:rPr>
+        <w:t>File -&gt; New file -&gt; R script</w:t>
+      </w:r>
+    </w:p>
+    <w:p>
+      <w:pPr>
+        <w:pStyle w:val="BodyText"/>
+        <w:rPr/>
+      </w:pPr>
+      <w:r>
+        <w:rPr/>
+        <w:t>and now you should have four windows that look something like this:</w:t>
       </w:r>
     </w:p>
     <w:p>
@@ -2921,7 +2925,7 @@
         <w:pStyle w:val="Heading1"/>
         <w:rPr/>
       </w:pPr>
-      <w:bookmarkStart w:id="31" w:name="__RefHeading___Toc2891_1119107993"/>
+      <w:bookmarkStart w:id="31" w:name="__RefHeading___Toc2893_2767856350"/>
       <w:bookmarkStart w:id="32" w:name="X1dfa707ce7590127fd35c80ace91218ec720c88"/>
       <w:bookmarkEnd w:id="31"/>
       <w:r>
@@ -2967,27 +2971,29 @@
       </w:pPr>
       <w:r>
         <w:rPr/>
-        <w:t xml:space="preserve">Now, in your Script window (top left) type the following text. Note the use of both comments, which are prefixed by </w:t>
-      </w:r>
-      <w:r>
-        <w:rPr>
-          <w:rStyle w:val="VerbatimChar"/>
-        </w:rPr>
-        <w:t>#</w:t>
-      </w:r>
-      <w:r>
-        <w:rPr/>
-        <w:t xml:space="preserve">, and blank lines to make the text more readable. Just as you use headings and paragraphs to make an essay easier to read, use </w:t>
-      </w:r>
-      <w:r>
-        <w:rPr>
-          <w:rStyle w:val="VerbatimChar"/>
-        </w:rPr>
-        <w:t>#</w:t>
-      </w:r>
-      <w:r>
-        <w:rPr/>
-        <w:t xml:space="preserve"> and blank lines to make your R script easier to understand:</w:t>
+        <w:t xml:space="preserve">Now, in your </w:t>
+      </w:r>
+      <w:r>
+        <w:rPr>
+          <w:b/>
+          <w:bCs/>
+        </w:rPr>
+        <w:t>Script window (top left)</w:t>
+      </w:r>
+      <w:r>
+        <w:rPr/>
+        <w:t xml:space="preserve"> which is probably headed </w:t>
+      </w:r>
+      <w:r>
+        <w:rPr>
+          <w:b/>
+          <w:bCs/>
+        </w:rPr>
+        <w:t>Untitled1</w:t>
+      </w:r>
+      <w:r>
+        <w:rPr/>
+        <w:t xml:space="preserve"> type the following text:</w:t>
       </w:r>
     </w:p>
     <w:p>
@@ -3164,16 +3170,12 @@
     </w:p>
     <w:p>
       <w:pPr>
-        <w:pStyle w:val="Compact"/>
-        <w:numPr>
-          <w:ilvl w:val="0"/>
-          <w:numId w:val="45"/>
-        </w:numPr>
-        <w:rPr/>
-      </w:pPr>
-      <w:r>
-        <w:rPr/>
-        <w:t xml:space="preserve">But </w:t>
+        <w:pStyle w:val="FirstParagraph"/>
+        <w:rPr/>
+      </w:pPr>
+      <w:r>
+        <w:rPr/>
+        <w:t xml:space="preserve">This is a very short piece of R commands but </w:t>
       </w:r>
       <w:r>
         <w:rPr>
@@ -3206,28 +3208,38 @@
       </w:r>
       <w:r>
         <w:rPr/>
-        <w:t xml:space="preserve"> it now makes sense. So we will add spaces, blank lines and </w:t>
+        <w:t xml:space="preserve"> it now makes sense. So we will add spaces, blank lines and comments. A comment is anything that follows the </w:t>
+      </w:r>
+      <w:r>
+        <w:rPr>
+          <w:rStyle w:val="VerbatimChar"/>
+        </w:rPr>
+        <w:t>#</w:t>
+      </w:r>
+      <w:r>
+        <w:rPr/>
+        <w:t xml:space="preserve"> symbol and is ignored by R, but helps you understand what you have done.</w:t>
+      </w:r>
+    </w:p>
+    <w:p>
+      <w:pPr>
+        <w:pStyle w:val="BodyText"/>
+        <w:rPr/>
+      </w:pPr>
+      <w:r>
+        <w:rPr/>
+        <w:t xml:space="preserve">So before going further, </w:t>
       </w:r>
       <w:r>
         <w:rPr>
           <w:b/>
           <w:bCs/>
         </w:rPr>
-        <w:t>Comments</w:t>
-      </w:r>
-      <w:r>
-        <w:rPr/>
-        <w:t xml:space="preserve">. A comment is anything that follows the </w:t>
-      </w:r>
-      <w:r>
-        <w:rPr>
-          <w:rStyle w:val="VerbatimChar"/>
-        </w:rPr>
-        <w:t>#</w:t>
-      </w:r>
-      <w:r>
-        <w:rPr/>
-        <w:t xml:space="preserve"> symbol and is ignored by R, but helps you understand what you have done. So before going further, edit your script to make it more readable, with comment lines, blank lines, and a space around the </w:t>
+        <w:t>edit your script as below</w:t>
+      </w:r>
+      <w:r>
+        <w:rPr/>
+        <w:t xml:space="preserve"> to make it more readable, with comment lines, blank lines, and a space around the </w:t>
       </w:r>
       <w:r>
         <w:rPr>
@@ -3237,7 +3249,7 @@
       </w:r>
       <w:r>
         <w:rPr/>
-        <w:t xml:space="preserve"> symbol, and in the </w:t>
+        <w:t xml:space="preserve"> symbol, and spaces in the </w:t>
       </w:r>
       <w:r>
         <w:rPr>
@@ -3247,7 +3259,37 @@
       </w:r>
       <w:r>
         <w:rPr/>
-        <w:t xml:space="preserve"> line:</w:t>
+        <w:t xml:space="preserve"> line between </w:t>
+      </w:r>
+      <w:r>
+        <w:rPr>
+          <w:rStyle w:val="VerbatimChar"/>
+        </w:rPr>
+        <w:t>yield</w:t>
+      </w:r>
+      <w:r>
+        <w:rPr/>
+        <w:t xml:space="preserve">, </w:t>
+      </w:r>
+      <w:r>
+        <w:rPr>
+          <w:rStyle w:val="VerbatimChar"/>
+        </w:rPr>
+        <w:t>~</w:t>
+      </w:r>
+      <w:r>
+        <w:rPr/>
+        <w:t xml:space="preserve">, </w:t>
+      </w:r>
+      <w:r>
+        <w:rPr>
+          <w:rStyle w:val="VerbatimChar"/>
+        </w:rPr>
+        <w:t>soil</w:t>
+      </w:r>
+      <w:r>
+        <w:rPr/>
+        <w:t xml:space="preserve"> etc.:</w:t>
       </w:r>
     </w:p>
     <w:p>
@@ -3452,7 +3494,17 @@
       </w:r>
       <w:r>
         <w:rPr/>
-        <w:t xml:space="preserve">. Next run each line of your script. Click on the </w:t>
+        <w:t>.</w:t>
+      </w:r>
+    </w:p>
+    <w:p>
+      <w:pPr>
+        <w:pStyle w:val="BodyText"/>
+        <w:rPr/>
+      </w:pPr>
+      <w:r>
+        <w:rPr/>
+        <w:t xml:space="preserve">Next run each line of your script. Click on the </w:t>
       </w:r>
       <w:r>
         <w:rPr>
@@ -3469,11 +3521,11 @@
           <w:b/>
           <w:bCs/>
         </w:rPr>
-        <w:t>Ctl-Shift-Enter</w:t>
-      </w:r>
-      <w:r>
-        <w:rPr/>
-        <w:t xml:space="preserve"> keys simultaneously. This key combination sends a line from your script to the Console window where it is executed. The command should run without displaying anything as </w:t>
+        <w:t>Ctl-Enter</w:t>
+      </w:r>
+      <w:r>
+        <w:rPr/>
+        <w:t xml:space="preserve"> keys simultaneously (on a MacBook it might be Ctl-Shift-Enter). This key combination sends a line from your script to the Console window where it is executed. The command should run without displaying anything as </w:t>
       </w:r>
       <w:r>
         <w:rPr>
@@ -3609,13 +3661,27 @@
         <w:pStyle w:val="Compact"/>
         <w:numPr>
           <w:ilvl w:val="0"/>
+          <w:numId w:val="45"/>
+        </w:numPr>
+        <w:rPr/>
+      </w:pPr>
+      <w:r>
+        <w:rPr/>
+        <w:t>Start up the File Manager either from the main Windows menu, or by entering “File Manager” in the search bar</w:t>
+      </w:r>
+    </w:p>
+    <w:p>
+      <w:pPr>
+        <w:pStyle w:val="Compact"/>
+        <w:numPr>
+          <w:ilvl w:val="0"/>
           <w:numId w:val="46"/>
         </w:numPr>
         <w:rPr/>
       </w:pPr>
       <w:r>
         <w:rPr/>
-        <w:t>Start up the File Manager either from the main Windows menu, or by entering “File Manager” in the search bar</w:t>
+        <w:t>Navigate to your Downloads folder</w:t>
       </w:r>
     </w:p>
     <w:p>
@@ -3629,7 +3695,17 @@
       </w:pPr>
       <w:r>
         <w:rPr/>
-        <w:t>Navigate to your Downloads folder</w:t>
+        <w:t xml:space="preserve">Locate the </w:t>
+      </w:r>
+      <w:r>
+        <w:rPr>
+          <w:rStyle w:val="VerbatimChar"/>
+        </w:rPr>
+        <w:t>yield</w:t>
+      </w:r>
+      <w:r>
+        <w:rPr/>
+        <w:t xml:space="preserve"> file in your Downloads folder</w:t>
       </w:r>
     </w:p>
     <w:p>
@@ -3643,7 +3719,7 @@
       </w:pPr>
       <w:r>
         <w:rPr/>
-        <w:t xml:space="preserve">Locate the </w:t>
+        <w:t xml:space="preserve">Right-click on your </w:t>
       </w:r>
       <w:r>
         <w:rPr>
@@ -3653,7 +3729,14 @@
       </w:r>
       <w:r>
         <w:rPr/>
-        <w:t xml:space="preserve"> file in your Downloads folder</w:t>
+        <w:t xml:space="preserve"> file and select </w:t>
+      </w:r>
+      <w:r>
+        <w:rPr>
+          <w:b/>
+          <w:bCs/>
+        </w:rPr>
+        <w:t>Copy</w:t>
       </w:r>
     </w:p>
     <w:p>
@@ -3667,24 +3750,25 @@
       </w:pPr>
       <w:r>
         <w:rPr/>
-        <w:t xml:space="preserve">Right-click on your </w:t>
-      </w:r>
-      <w:r>
-        <w:rPr>
-          <w:rStyle w:val="VerbatimChar"/>
-        </w:rPr>
-        <w:t>yield</w:t>
-      </w:r>
-      <w:r>
-        <w:rPr/>
-        <w:t xml:space="preserve"> file and select </w:t>
+        <w:t xml:space="preserve">Navigate to your NES2504 folder, Right-Click inside it and select </w:t>
       </w:r>
       <w:r>
         <w:rPr>
           <w:b/>
           <w:bCs/>
         </w:rPr>
-        <w:t>Copy</w:t>
+        <w:t>New Folder</w:t>
+      </w:r>
+      <w:r>
+        <w:rPr/>
+        <w:t xml:space="preserve">. Call your new folde </w:t>
+      </w:r>
+      <w:r>
+        <w:rPr>
+          <w:b/>
+          <w:bCs/>
+        </w:rPr>
+        <w:t>Data</w:t>
       </w:r>
     </w:p>
     <w:p>
@@ -3698,25 +3782,7 @@
       </w:pPr>
       <w:r>
         <w:rPr/>
-        <w:t xml:space="preserve">Navigate to your NES2504 folder, Right-Click inside it and select </w:t>
-      </w:r>
-      <w:r>
-        <w:rPr>
-          <w:b/>
-          <w:bCs/>
-        </w:rPr>
-        <w:t>New Folder</w:t>
-      </w:r>
-      <w:r>
-        <w:rPr/>
-        <w:t xml:space="preserve">. Call your new folde </w:t>
-      </w:r>
-      <w:r>
-        <w:rPr>
-          <w:b/>
-          <w:bCs/>
-        </w:rPr>
-        <w:t>Data</w:t>
+        <w:t>Double-click on the Data icon to navigate into it</w:t>
       </w:r>
     </w:p>
     <w:p>
@@ -3730,7 +3796,14 @@
       </w:pPr>
       <w:r>
         <w:rPr/>
-        <w:t>Double-click on the Data icon to navigate into it</w:t>
+        <w:t xml:space="preserve">Right-click and select </w:t>
+      </w:r>
+      <w:r>
+        <w:rPr>
+          <w:b/>
+          <w:bCs/>
+        </w:rPr>
+        <w:t>Paste</w:t>
       </w:r>
     </w:p>
     <w:p>
@@ -3744,14 +3817,78 @@
       </w:pPr>
       <w:r>
         <w:rPr/>
-        <w:t xml:space="preserve">Right-click and select </w:t>
+        <w:t xml:space="preserve">Go back to RStudio, and in the Files tab (bottom right) click on the “refresh” button (a small circular arrow on the right of the files tab). You should see the </w:t>
+      </w:r>
+      <w:r>
+        <w:rPr>
+          <w:rStyle w:val="VerbatimChar"/>
+        </w:rPr>
+        <w:t>Data</w:t>
+      </w:r>
+      <w:r>
+        <w:rPr/>
+        <w:t xml:space="preserve"> subfolder, and if you look inside it, you’ll see the </w:t>
+      </w:r>
+      <w:r>
+        <w:rPr>
+          <w:rStyle w:val="VerbatimChar"/>
+        </w:rPr>
+        <w:t>yield</w:t>
+      </w:r>
+      <w:r>
+        <w:rPr/>
+        <w:t xml:space="preserve"> file listed.</w:t>
+      </w:r>
+    </w:p>
+    <w:p>
+      <w:pPr>
+        <w:pStyle w:val="FirstParagraph"/>
+        <w:rPr/>
+      </w:pPr>
+      <w:r>
+        <w:rPr/>
+        <w:t xml:space="preserve">Now go back to your R script and try re-running the </w:t>
+      </w:r>
+      <w:r>
+        <w:rPr>
+          <w:rStyle w:val="VerbatimChar"/>
+        </w:rPr>
+        <w:t>read.csv</w:t>
+      </w:r>
+      <w:r>
+        <w:rPr/>
+        <w:t xml:space="preserve"> command by clicking on the line, and hitting the Ctrl-Shift-Enter key combination again. BUT </w:t>
       </w:r>
       <w:r>
         <w:rPr>
           <w:b/>
           <w:bCs/>
         </w:rPr>
-        <w:t>Paste</w:t>
+        <w:t>it does not work</w:t>
+      </w:r>
+      <w:r>
+        <w:rPr/>
+        <w:t>. You get the same error message!! Why??</w:t>
+      </w:r>
+    </w:p>
+    <w:p>
+      <w:pPr>
+        <w:pStyle w:val="BodyText"/>
+        <w:rPr/>
+      </w:pPr>
+      <w:r>
+        <w:rPr/>
+        <w:t xml:space="preserve">This is such a common error, that I thought it worth emphasising it. Some of you may even have already worked out what has gone wrong. The clue is in the name of the command </w:t>
+      </w:r>
+      <w:r>
+        <w:rPr>
+          <w:rStyle w:val="VerbatimChar"/>
+        </w:rPr>
+        <w:t>read.csv</w:t>
+      </w:r>
+      <w:r>
+        <w:rPr/>
+        <w:t xml:space="preserve"> which is to read a CSV file. What is this:</w:t>
       </w:r>
     </w:p>
     <w:p>
@@ -3765,78 +3902,7 @@
       </w:pPr>
       <w:r>
         <w:rPr/>
-        <w:t xml:space="preserve">Go back to RStudio, and in the Files tab (bottom right) click on the “refresh” button (a small circular arrow on the right of the files tab). You should see the </w:t>
-      </w:r>
-      <w:r>
-        <w:rPr>
-          <w:rStyle w:val="VerbatimChar"/>
-        </w:rPr>
-        <w:t>Data</w:t>
-      </w:r>
-      <w:r>
-        <w:rPr/>
-        <w:t xml:space="preserve"> subfolder, and if you look inside it, you’ll see the </w:t>
-      </w:r>
-      <w:r>
-        <w:rPr>
-          <w:rStyle w:val="VerbatimChar"/>
-        </w:rPr>
-        <w:t>yield</w:t>
-      </w:r>
-      <w:r>
-        <w:rPr/>
-        <w:t xml:space="preserve"> file listed.</w:t>
-      </w:r>
-    </w:p>
-    <w:p>
-      <w:pPr>
-        <w:pStyle w:val="FirstParagraph"/>
-        <w:rPr/>
-      </w:pPr>
-      <w:r>
-        <w:rPr/>
-        <w:t xml:space="preserve">Now go back to your R script and try re-running the </w:t>
-      </w:r>
-      <w:r>
-        <w:rPr>
-          <w:rStyle w:val="VerbatimChar"/>
-        </w:rPr>
-        <w:t>read.csv</w:t>
-      </w:r>
-      <w:r>
-        <w:rPr/>
-        <w:t xml:space="preserve"> command by clicking on the line, and hitting the Ctrl-Shift-Enter key combination again. BUT </w:t>
-      </w:r>
-      <w:r>
-        <w:rPr>
-          <w:b/>
-          <w:bCs/>
-        </w:rPr>
-        <w:t>it does not work</w:t>
-      </w:r>
-      <w:r>
-        <w:rPr/>
-        <w:t>. You get the same error message!! Why??</w:t>
-      </w:r>
-    </w:p>
-    <w:p>
-      <w:pPr>
-        <w:pStyle w:val="BodyText"/>
-        <w:rPr/>
-      </w:pPr>
-      <w:r>
-        <w:rPr/>
-        <w:t xml:space="preserve">This is such a common error, that I thought it worth emphasising it. Some of you may even have already worked out what has gone wrong. The clue is in the name of the command </w:t>
-      </w:r>
-      <w:r>
-        <w:rPr>
-          <w:rStyle w:val="VerbatimChar"/>
-        </w:rPr>
-        <w:t>read.csv</w:t>
-      </w:r>
-      <w:r>
-        <w:rPr/>
-        <w:t xml:space="preserve"> which is to read a CSV file. What is this:</w:t>
+        <w:t>CSV stands for “comma separated value” and is a plain text, simple file, that can be read by hundreds of different programs and apps</w:t>
       </w:r>
     </w:p>
     <w:p>
@@ -3845,20 +3911,6 @@
         <w:numPr>
           <w:ilvl w:val="0"/>
           <w:numId w:val="54"/>
-        </w:numPr>
-        <w:rPr/>
-      </w:pPr>
-      <w:r>
-        <w:rPr/>
-        <w:t>CSV stands for “comma separated value” and is a plain text, simple file, that can be read by hundreds of different programs and apps</w:t>
-      </w:r>
-    </w:p>
-    <w:p>
-      <w:pPr>
-        <w:pStyle w:val="Compact"/>
-        <w:numPr>
-          <w:ilvl w:val="0"/>
-          <w:numId w:val="55"/>
         </w:numPr>
         <w:rPr/>
       </w:pPr>
@@ -4000,6 +4052,36 @@
         <w:pStyle w:val="Compact"/>
         <w:numPr>
           <w:ilvl w:val="0"/>
+          <w:numId w:val="55"/>
+        </w:numPr>
+        <w:rPr/>
+      </w:pPr>
+      <w:r>
+        <w:rPr>
+          <w:rStyle w:val="VerbatimChar"/>
+        </w:rPr>
+        <w:t>yield</w:t>
+      </w:r>
+      <w:r>
+        <w:rPr/>
+        <w:t xml:space="preserve"> which is </w:t>
+      </w:r>
+      <w:r>
+        <w:rPr>
+          <w:rStyle w:val="VerbatimChar"/>
+        </w:rPr>
+        <w:t>yield.csv</w:t>
+      </w:r>
+      <w:r>
+        <w:rPr/>
+        <w:t xml:space="preserve"> in Comma Separated Value format</w:t>
+      </w:r>
+    </w:p>
+    <w:p>
+      <w:pPr>
+        <w:pStyle w:val="Compact"/>
+        <w:numPr>
+          <w:ilvl w:val="0"/>
           <w:numId w:val="56"/>
         </w:numPr>
         <w:rPr/>
@@ -4018,11 +4100,53 @@
         <w:rPr>
           <w:rStyle w:val="VerbatimChar"/>
         </w:rPr>
-        <w:t>yield.csv</w:t>
-      </w:r>
-      <w:r>
-        <w:rPr/>
-        <w:t xml:space="preserve"> in Comma Separated Value format</w:t>
+        <w:t>yield.xlsx</w:t>
+      </w:r>
+      <w:r>
+        <w:rPr/>
+        <w:t xml:space="preserve"> in Microsoft Excel format</w:t>
+      </w:r>
+    </w:p>
+    <w:p>
+      <w:pPr>
+        <w:pStyle w:val="FirstParagraph"/>
+        <w:rPr/>
+      </w:pPr>
+      <w:r>
+        <w:rPr/>
+        <w:t xml:space="preserve">Look very carefully and you can see that the icons for the two yield files are slightly different, as one has </w:t>
+      </w:r>
+      <w:r>
+        <w:rPr>
+          <w:b/>
+          <w:bCs/>
+        </w:rPr>
+        <w:t>,a</w:t>
+      </w:r>
+      <w:r>
+        <w:rPr/>
+        <w:t xml:space="preserve"> in it. You can change the settings in File Manager so that full file names with the final “extension” are showing. For the bulk of the NES2504 course all the files will be CSV format, so you will not have this problem. But sometimes data will be in Excel format so it is essential you know how to convert to CSV.</w:t>
+      </w:r>
+    </w:p>
+    <w:p>
+      <w:pPr>
+        <w:pStyle w:val="BodyText"/>
+        <w:rPr/>
+      </w:pPr>
+      <w:r>
+        <w:rPr/>
+        <w:t xml:space="preserve">Stay in the File Manager and navigate one level higher to the </w:t>
+      </w:r>
+      <w:r>
+        <w:rPr>
+          <w:b/>
+          <w:bCs/>
+        </w:rPr>
+        <w:t>NES2504</w:t>
+      </w:r>
+      <w:r>
+        <w:rPr/>
+        <w:t xml:space="preserve"> folder. You should see 3 items</w:t>
       </w:r>
     </w:p>
     <w:p>
@@ -4038,63 +4162,21 @@
         <w:rPr>
           <w:rStyle w:val="VerbatimChar"/>
         </w:rPr>
+        <w:t>Data</w:t>
+      </w:r>
+      <w:r>
+        <w:rPr/>
+        <w:t xml:space="preserve"> folder you’ve just created with your two </w:t>
+      </w:r>
+      <w:r>
+        <w:rPr>
+          <w:rStyle w:val="VerbatimChar"/>
+        </w:rPr>
         <w:t>yield</w:t>
       </w:r>
       <w:r>
         <w:rPr/>
-        <w:t xml:space="preserve"> which is </w:t>
-      </w:r>
-      <w:r>
-        <w:rPr>
-          <w:rStyle w:val="VerbatimChar"/>
-        </w:rPr>
-        <w:t>yield.xlsx</w:t>
-      </w:r>
-      <w:r>
-        <w:rPr/>
-        <w:t xml:space="preserve"> in Microsoft Excel format</w:t>
-      </w:r>
-    </w:p>
-    <w:p>
-      <w:pPr>
-        <w:pStyle w:val="FirstParagraph"/>
-        <w:rPr/>
-      </w:pPr>
-      <w:r>
-        <w:rPr/>
-        <w:t xml:space="preserve">Look very carefully and you can see that the icons for the two yield files are slightly different, as one has </w:t>
-      </w:r>
-      <w:r>
-        <w:rPr>
-          <w:b/>
-          <w:bCs/>
-        </w:rPr>
-        <w:t>,a</w:t>
-      </w:r>
-      <w:r>
-        <w:rPr/>
-        <w:t xml:space="preserve"> in it. You can change the settings in File Manager so that full file names with the final “extension” are showing. For the bulk of the NES2504 course all the files will be CSV format, so you will not have this problem. But sometimes data will be in Excel format so it is essential you know how to convert to CSV.</w:t>
-      </w:r>
-    </w:p>
-    <w:p>
-      <w:pPr>
-        <w:pStyle w:val="BodyText"/>
-        <w:rPr/>
-      </w:pPr>
-      <w:r>
-        <w:rPr/>
-        <w:t xml:space="preserve">Stay in the File Manager and navigate one level higher to the </w:t>
-      </w:r>
-      <w:r>
-        <w:rPr>
-          <w:b/>
-          <w:bCs/>
-        </w:rPr>
-        <w:t>NES2504</w:t>
-      </w:r>
-      <w:r>
-        <w:rPr/>
-        <w:t xml:space="preserve"> folder. You should see 3 items</w:t>
+        <w:t xml:space="preserve"> files</w:t>
       </w:r>
     </w:p>
     <w:p>
@@ -4110,21 +4192,21 @@
         <w:rPr>
           <w:rStyle w:val="VerbatimChar"/>
         </w:rPr>
-        <w:t>Data</w:t>
-      </w:r>
-      <w:r>
-        <w:rPr/>
-        <w:t xml:space="preserve"> folder you’ve just created with your two </w:t>
-      </w:r>
-      <w:r>
-        <w:rPr>
-          <w:rStyle w:val="VerbatimChar"/>
-        </w:rPr>
-        <w:t>yield</w:t>
-      </w:r>
-      <w:r>
-        <w:rPr/>
-        <w:t xml:space="preserve"> files</w:t>
+        <w:t>NES2504</w:t>
+      </w:r>
+      <w:r>
+        <w:rPr/>
+        <w:t xml:space="preserve"> which is actually </w:t>
+      </w:r>
+      <w:r>
+        <w:rPr>
+          <w:rStyle w:val="VerbatimChar"/>
+        </w:rPr>
+        <w:t>NES2504.RProj</w:t>
+      </w:r>
+      <w:r>
+        <w:rPr/>
+        <w:t xml:space="preserve"> and contains your RStudio project settings</w:t>
       </w:r>
     </w:p>
     <w:p>
@@ -4140,21 +4222,642 @@
         <w:rPr>
           <w:rStyle w:val="VerbatimChar"/>
         </w:rPr>
+        <w:t>practical0</w:t>
+      </w:r>
+      <w:r>
+        <w:rPr/>
+        <w:t xml:space="preserve"> which is actually </w:t>
+      </w:r>
+      <w:r>
+        <w:rPr>
+          <w:rStyle w:val="VerbatimChar"/>
+        </w:rPr>
+        <w:t>practical0.R</w:t>
+      </w:r>
+      <w:r>
+        <w:rPr/>
+        <w:t xml:space="preserve"> and contains your script with R commands</w:t>
+      </w:r>
+    </w:p>
+    <w:p>
+      <w:pPr>
+        <w:pStyle w:val="FirstParagraph"/>
+        <w:rPr/>
+      </w:pPr>
+      <w:r>
+        <w:rPr/>
+        <w:t xml:space="preserve">Go back to RStudio and re-run your </w:t>
+      </w:r>
+      <w:r>
+        <w:rPr>
+          <w:rStyle w:val="VerbatimChar"/>
+        </w:rPr>
+        <w:t>read.csv</w:t>
+      </w:r>
+      <w:r>
+        <w:rPr/>
+        <w:t xml:space="preserve"> line.</w:t>
+      </w:r>
+    </w:p>
+    <w:p>
+      <w:pPr>
+        <w:pStyle w:val="BodyText"/>
+        <w:rPr/>
+      </w:pPr>
+      <w:r>
+        <w:rPr/>
+        <w:t xml:space="preserve">If it is successful, nothing will be displayed in the console, but in your Environment window (top right panel) you should see the table (data frame) </w:t>
+      </w:r>
+      <w:r>
+        <w:rPr>
+          <w:rStyle w:val="VerbatimChar"/>
+        </w:rPr>
+        <w:t>pract0_dat</w:t>
+      </w:r>
+      <w:r>
+        <w:rPr/>
+        <w:t xml:space="preserve"> listed, and when you run the </w:t>
+      </w:r>
+      <w:r>
+        <w:rPr>
+          <w:rStyle w:val="VerbatimChar"/>
+        </w:rPr>
+        <w:t>summary(pract0_dat)</w:t>
+      </w:r>
+      <w:r>
+        <w:rPr/>
+        <w:t xml:space="preserve"> and </w:t>
+      </w:r>
+      <w:r>
+        <w:rPr>
+          <w:rStyle w:val="VerbatimChar"/>
+        </w:rPr>
+        <w:t>mean(yield ~ soil, data = pract0_dat)</w:t>
+      </w:r>
+      <w:r>
+        <w:rPr/>
+        <w:t xml:space="preserve"> commands you should see:</w:t>
+      </w:r>
+    </w:p>
+    <w:p>
+      <w:pPr>
+        <w:pStyle w:val="SourceCode"/>
+        <w:rPr/>
+      </w:pPr>
+      <w:r>
+        <w:rPr>
+          <w:rStyle w:val="VerbatimChar"/>
+        </w:rPr>
+        <w:t xml:space="preserve">        </w:t>
+      </w:r>
+      <w:r>
+        <w:rPr>
+          <w:rStyle w:val="VerbatimChar"/>
+        </w:rPr>
+        <w:t xml:space="preserve">soil        yield      </w:t>
+      </w:r>
+      <w:r>
+        <w:rPr/>
+        <w:br/>
+      </w:r>
+      <w:r>
+        <w:rPr>
+          <w:rStyle w:val="VerbatimChar"/>
+        </w:rPr>
+        <w:t xml:space="preserve"> Length   :30   Min.   : 3.00  </w:t>
+      </w:r>
+      <w:r>
+        <w:rPr/>
+        <w:br/>
+      </w:r>
+      <w:r>
+        <w:rPr>
+          <w:rStyle w:val="VerbatimChar"/>
+        </w:rPr>
+        <w:t xml:space="preserve"> N.unique : 3   1st Qu.: 9.25  </w:t>
+      </w:r>
+      <w:r>
+        <w:rPr/>
+        <w:br/>
+      </w:r>
+      <w:r>
+        <w:rPr>
+          <w:rStyle w:val="VerbatimChar"/>
+        </w:rPr>
+        <w:t xml:space="preserve"> N.blank  : 0   Median :12.00  </w:t>
+      </w:r>
+      <w:r>
+        <w:rPr/>
+        <w:br/>
+      </w:r>
+      <w:r>
+        <w:rPr>
+          <w:rStyle w:val="VerbatimChar"/>
+        </w:rPr>
+        <w:t xml:space="preserve"> Min.nchar: 4   Mean   :11.90  </w:t>
+      </w:r>
+      <w:r>
+        <w:rPr/>
+        <w:br/>
+      </w:r>
+      <w:r>
+        <w:rPr>
+          <w:rStyle w:val="VerbatimChar"/>
+        </w:rPr>
+        <w:t xml:space="preserve"> Max.nchar: 4   3rd Qu.:14.75  </w:t>
+      </w:r>
+      <w:r>
+        <w:rPr/>
+        <w:br/>
+      </w:r>
+      <w:r>
+        <w:rPr>
+          <w:rStyle w:val="VerbatimChar"/>
+        </w:rPr>
+        <w:t xml:space="preserve">                Max.   :18.00  </w:t>
+      </w:r>
+    </w:p>
+    <w:p>
+      <w:pPr>
+        <w:pStyle w:val="SourceCode"/>
+        <w:rPr/>
+      </w:pPr>
+      <w:r>
+        <w:rPr>
+          <w:rStyle w:val="VerbatimChar"/>
+        </w:rPr>
+        <w:t xml:space="preserve">clay loam sand </w:t>
+      </w:r>
+      <w:r>
+        <w:rPr/>
+        <w:br/>
+      </w:r>
+      <w:r>
+        <w:rPr>
+          <w:rStyle w:val="VerbatimChar"/>
+        </w:rPr>
+        <w:t xml:space="preserve">11.5 14.3  9.9 </w:t>
+      </w:r>
+    </w:p>
+    <w:p>
+      <w:pPr>
+        <w:pStyle w:val="FirstParagraph"/>
+        <w:rPr/>
+      </w:pPr>
+      <w:r>
+        <w:rPr/>
+        <w:t xml:space="preserve">Success! </w:t>
+      </w:r>
+      <w:r>
+        <w:rPr>
+          <w:b/>
+          <w:bCs/>
+        </w:rPr>
+        <w:t>Important</w:t>
+      </w:r>
+      <w:r>
+        <w:rPr/>
+        <w:t xml:space="preserve"> Please speak to staff or the demonstrators know if you have problems with this step.</w:t>
+      </w:r>
+    </w:p>
+    <w:p>
+      <w:pPr>
+        <w:pStyle w:val="Heading2"/>
+        <w:rPr/>
+      </w:pPr>
+      <w:bookmarkStart w:id="33" w:name="where-to-store-your-csv-files"/>
+      <w:r>
+        <w:rPr/>
+        <w:t>6.1 Where to store your CSV files?</w:t>
+      </w:r>
+    </w:p>
+    <w:p>
+      <w:pPr>
+        <w:pStyle w:val="FirstParagraph"/>
+        <w:rPr/>
+      </w:pPr>
+      <w:r>
+        <w:rPr/>
+        <w:t xml:space="preserve">You can store them either in your main project folder or your </w:t>
+      </w:r>
+      <w:r>
+        <w:rPr>
+          <w:rStyle w:val="VerbatimChar"/>
+        </w:rPr>
+        <w:t>Data</w:t>
+      </w:r>
+      <w:r>
+        <w:rPr/>
+        <w:t xml:space="preserve"> folder but if you have lots of data files this can get confusing, so we recommend creating a folder called </w:t>
+      </w:r>
+      <w:r>
+        <w:rPr>
+          <w:rStyle w:val="VerbatimChar"/>
+          <w:b/>
+          <w:bCs/>
+        </w:rPr>
+        <w:t>Data</w:t>
+      </w:r>
+      <w:r>
+        <w:rPr/>
+        <w:t xml:space="preserve"> inside your </w:t>
+      </w:r>
+      <w:r>
+        <w:rPr>
+          <w:rStyle w:val="VerbatimChar"/>
+        </w:rPr>
         <w:t>NES2504</w:t>
       </w:r>
       <w:r>
         <w:rPr/>
-        <w:t xml:space="preserve"> which is actually </w:t>
-      </w:r>
-      <w:r>
-        <w:rPr>
-          <w:rStyle w:val="VerbatimChar"/>
-        </w:rPr>
-        <w:t>NES2504.RProj</w:t>
-      </w:r>
-      <w:r>
-        <w:rPr/>
-        <w:t xml:space="preserve"> and contains your RStudio project settings</w:t>
+        <w:t xml:space="preserve"> project folder, and putting your CSV files there.</w:t>
+      </w:r>
+      <w:bookmarkEnd w:id="32"/>
+      <w:bookmarkEnd w:id="33"/>
+    </w:p>
+    <w:p>
+      <w:pPr>
+        <w:pStyle w:val="Heading1"/>
+        <w:rPr/>
+      </w:pPr>
+      <w:bookmarkStart w:id="34" w:name="__RefHeading___Toc2895_2767856350"/>
+      <w:bookmarkStart w:id="35" w:name="working-with-data"/>
+      <w:bookmarkEnd w:id="34"/>
+      <w:r>
+        <w:rPr/>
+        <w:t>7. Working with data</w:t>
+      </w:r>
+    </w:p>
+    <w:p>
+      <w:pPr>
+        <w:pStyle w:val="Heading2"/>
+        <w:rPr/>
+      </w:pPr>
+      <w:bookmarkStart w:id="36" w:name="using-r-as-a-calculator"/>
+      <w:r>
+        <w:rPr/>
+        <w:t>7.1 Using R as a calculator</w:t>
+      </w:r>
+    </w:p>
+    <w:p>
+      <w:pPr>
+        <w:pStyle w:val="FirstParagraph"/>
+        <w:rPr/>
+      </w:pPr>
+      <w:r>
+        <w:rPr/>
+        <w:t xml:space="preserve">You probably won’t use this very often, but you can easily enter values into the </w:t>
+      </w:r>
+      <w:r>
+        <w:rPr>
+          <w:b/>
+          <w:bCs/>
+        </w:rPr>
+        <w:t>Console</w:t>
+      </w:r>
+      <w:r>
+        <w:rPr/>
+        <w:t xml:space="preserve"> window if you need to do some quick arithmetic:</w:t>
+      </w:r>
+    </w:p>
+    <w:p>
+      <w:pPr>
+        <w:pStyle w:val="SourceCode"/>
+        <w:rPr/>
+      </w:pPr>
+      <w:r>
+        <w:rPr>
+          <w:rStyle w:val="DecValTok"/>
+        </w:rPr>
+        <w:t>7</w:t>
+      </w:r>
+      <w:r>
+        <w:rPr>
+          <w:rStyle w:val="NormalTok"/>
+        </w:rPr>
+        <w:t xml:space="preserve"> </w:t>
+      </w:r>
+      <w:r>
+        <w:rPr>
+          <w:rStyle w:val="SpecialCharTok"/>
+        </w:rPr>
+        <w:t>*</w:t>
+      </w:r>
+      <w:r>
+        <w:rPr>
+          <w:rStyle w:val="NormalTok"/>
+        </w:rPr>
+        <w:t xml:space="preserve"> </w:t>
+      </w:r>
+      <w:r>
+        <w:rPr>
+          <w:rStyle w:val="DecValTok"/>
+        </w:rPr>
+        <w:t>3</w:t>
+      </w:r>
+      <w:r>
+        <w:rPr/>
+        <w:br/>
+      </w:r>
+      <w:r>
+        <w:rPr>
+          <w:rStyle w:val="FunctionTok"/>
+        </w:rPr>
+        <w:t>log</w:t>
+      </w:r>
+      <w:r>
+        <w:rPr>
+          <w:rStyle w:val="NormalTok"/>
+        </w:rPr>
+        <w:t>(</w:t>
+      </w:r>
+      <w:r>
+        <w:rPr>
+          <w:rStyle w:val="DecValTok"/>
+        </w:rPr>
+        <w:t>24</w:t>
+      </w:r>
+      <w:r>
+        <w:rPr>
+          <w:rStyle w:val="NormalTok"/>
+        </w:rPr>
+        <w:t>)</w:t>
+      </w:r>
+      <w:r>
+        <w:rPr/>
+        <w:br/>
+      </w:r>
+      <w:r>
+        <w:rPr>
+          <w:rStyle w:val="DecValTok"/>
+        </w:rPr>
+        <w:t>4</w:t>
+      </w:r>
+      <w:r>
+        <w:rPr>
+          <w:rStyle w:val="SpecialCharTok"/>
+        </w:rPr>
+        <w:t>^</w:t>
+      </w:r>
+      <w:r>
+        <w:rPr>
+          <w:rStyle w:val="DecValTok"/>
+        </w:rPr>
+        <w:t>2</w:t>
+      </w:r>
+      <w:r>
+        <w:rPr/>
+        <w:br/>
+      </w:r>
+      <w:r>
+        <w:rPr>
+          <w:rStyle w:val="DecValTok"/>
+        </w:rPr>
+        <w:t>7</w:t>
+      </w:r>
+      <w:r>
+        <w:rPr>
+          <w:rStyle w:val="NormalTok"/>
+        </w:rPr>
+        <w:t xml:space="preserve"> </w:t>
+      </w:r>
+      <w:r>
+        <w:rPr>
+          <w:rStyle w:val="SpecialCharTok"/>
+        </w:rPr>
+        <w:t>/</w:t>
+      </w:r>
+      <w:r>
+        <w:rPr>
+          <w:rStyle w:val="NormalTok"/>
+        </w:rPr>
+        <w:t xml:space="preserve"> </w:t>
+      </w:r>
+      <w:r>
+        <w:rPr>
+          <w:rStyle w:val="DecValTok"/>
+        </w:rPr>
+        <w:t>3</w:t>
+      </w:r>
+      <w:r>
+        <w:rPr/>
+        <w:br/>
+      </w:r>
+      <w:r>
+        <w:rPr>
+          <w:rStyle w:val="NormalTok"/>
+        </w:rPr>
+        <w:t xml:space="preserve">pi </w:t>
+      </w:r>
+      <w:r>
+        <w:rPr>
+          <w:rStyle w:val="SpecialCharTok"/>
+        </w:rPr>
+        <w:t>*</w:t>
+      </w:r>
+      <w:r>
+        <w:rPr>
+          <w:rStyle w:val="NormalTok"/>
+        </w:rPr>
+        <w:t xml:space="preserve"> </w:t>
+      </w:r>
+      <w:r>
+        <w:rPr>
+          <w:rStyle w:val="DecValTok"/>
+        </w:rPr>
+        <w:t>3</w:t>
+      </w:r>
+      <w:r>
+        <w:rPr>
+          <w:rStyle w:val="NormalTok"/>
+        </w:rPr>
+        <w:t xml:space="preserve"> </w:t>
+      </w:r>
+      <w:r>
+        <w:rPr>
+          <w:rStyle w:val="SpecialCharTok"/>
+        </w:rPr>
+        <w:t>^</w:t>
+      </w:r>
+      <w:r>
+        <w:rPr>
+          <w:rStyle w:val="NormalTok"/>
+        </w:rPr>
+        <w:t xml:space="preserve"> </w:t>
+      </w:r>
+      <w:r>
+        <w:rPr>
+          <w:rStyle w:val="DecValTok"/>
+        </w:rPr>
+        <w:t>2</w:t>
+      </w:r>
+    </w:p>
+    <w:p>
+      <w:pPr>
+        <w:pStyle w:val="FirstParagraph"/>
+        <w:rPr/>
+      </w:pPr>
+      <w:r>
+        <w:rPr/>
+        <w:t xml:space="preserve">As you have typed the above into the Console window it isn’t saved after you finish today’s practical, but it doesn’t matter for some quick temporary calculations. Individual numbers, columns, rows, or tables of data, the results from calculations, statistical analyses and graphs are all </w:t>
+      </w:r>
+      <w:r>
+        <w:rPr>
+          <w:b/>
+          <w:bCs/>
+        </w:rPr>
+        <w:t>R objects</w:t>
+      </w:r>
+      <w:r>
+        <w:rPr/>
+        <w:t xml:space="preserve"> and the ones you have created in your current RStudio are shown in the top right </w:t>
+      </w:r>
+      <w:r>
+        <w:rPr>
+          <w:b/>
+          <w:bCs/>
+        </w:rPr>
+        <w:t>Environment</w:t>
+      </w:r>
+      <w:r>
+        <w:rPr/>
+        <w:t xml:space="preserve"> panel.</w:t>
+      </w:r>
+    </w:p>
+    <w:p>
+      <w:pPr>
+        <w:pStyle w:val="BodyText"/>
+        <w:rPr/>
+      </w:pPr>
+      <w:bookmarkStart w:id="37" w:name="using-r-as-a-calculator"/>
+      <w:r>
+        <w:rPr/>
+        <w:t>As mentioned before R is a programming language, as with any language there is some vocab that needs to be covered in order to help your understanding of what is being described.</w:t>
+      </w:r>
+      <w:bookmarkEnd w:id="37"/>
+    </w:p>
+    <w:p>
+      <w:pPr>
+        <w:pStyle w:val="Heading2"/>
+        <w:rPr/>
+      </w:pPr>
+      <w:bookmarkStart w:id="38" w:name="creating-objects"/>
+      <w:r>
+        <w:rPr/>
+        <w:t>7.2 Creating Objects</w:t>
+      </w:r>
+    </w:p>
+    <w:p>
+      <w:pPr>
+        <w:pStyle w:val="FirstParagraph"/>
+        <w:rPr/>
+      </w:pPr>
+      <w:r>
+        <w:rPr/>
+        <w:t xml:space="preserve">Although you have done some arithmetic above, it is much more useful to </w:t>
+      </w:r>
+      <w:r>
+        <w:rPr>
+          <w:b/>
+          <w:bCs/>
+        </w:rPr>
+        <w:t>assign</w:t>
+      </w:r>
+      <w:r>
+        <w:rPr/>
+        <w:t xml:space="preserve"> the results to an R object, so you can re-use them later. You do this using the assignment symbol </w:t>
+      </w:r>
+      <w:r>
+        <w:rPr>
+          <w:rStyle w:val="VerbatimChar"/>
+        </w:rPr>
+        <w:t>&lt;-</w:t>
+      </w:r>
+      <w:r>
+        <w:rPr/>
+        <w:t xml:space="preserve"> which looks like a left arrow. If you are having trouble finding the </w:t>
+      </w:r>
+      <w:r>
+        <w:rPr>
+          <w:rStyle w:val="VerbatimChar"/>
+        </w:rPr>
+        <w:t>&lt;</w:t>
+      </w:r>
+      <w:r>
+        <w:rPr/>
+        <w:t xml:space="preserve"> and </w:t>
+      </w:r>
+      <w:r>
+        <w:rPr>
+          <w:rStyle w:val="VerbatimChar"/>
+        </w:rPr>
+        <w:t>-</w:t>
+      </w:r>
+      <w:r>
+        <w:rPr/>
+        <w:t xml:space="preserve"> keys, a handy shortcut is to press</w:t>
+      </w:r>
+    </w:p>
+    <w:p>
+      <w:pPr>
+        <w:pStyle w:val="BodyText"/>
+        <w:rPr/>
+      </w:pPr>
+      <w:r>
+        <w:rPr/>
+        <w:t xml:space="preserve">typing Alt + - (push Alt at the same time as the - key) will write </w:t>
+      </w:r>
+      <w:r>
+        <w:rPr>
+          <w:rStyle w:val="VerbatimChar"/>
+        </w:rPr>
+        <w:t>&lt;-</w:t>
+      </w:r>
+      <w:r>
+        <w:rPr/>
+        <w:t xml:space="preserve"> in a single keystroke.</w:t>
+      </w:r>
+    </w:p>
+    <w:p>
+      <w:pPr>
+        <w:pStyle w:val="BodyText"/>
+        <w:rPr/>
+      </w:pPr>
+      <w:r>
+        <w:rPr/>
+        <w:t xml:space="preserve">Now you can </w:t>
+      </w:r>
+      <w:r>
+        <w:rPr>
+          <w:i/>
+          <w:iCs/>
+        </w:rPr>
+        <w:t>assign</w:t>
+      </w:r>
+      <w:r>
+        <w:rPr/>
+        <w:t xml:space="preserve"> a value(s) to an </w:t>
+      </w:r>
+      <w:r>
+        <w:rPr>
+          <w:i/>
+          <w:iCs/>
+        </w:rPr>
+        <w:t>object</w:t>
+      </w:r>
+      <w:r>
+        <w:rPr/>
+        <w:t xml:space="preserve"> so that R remembers it. You need to come up with a name for your object. Come up with a good name!</w:t>
+      </w:r>
+    </w:p>
+    <w:p>
+      <w:pPr>
+        <w:pStyle w:val="BodyText"/>
+        <w:rPr/>
+      </w:pPr>
+      <w:r>
+        <w:rPr/>
+        <w:t>Good names:</w:t>
       </w:r>
     </w:p>
     <w:p>
@@ -4170,642 +4873,7 @@
         <w:rPr>
           <w:rStyle w:val="VerbatimChar"/>
         </w:rPr>
-        <w:t>practical0</w:t>
-      </w:r>
-      <w:r>
-        <w:rPr/>
-        <w:t xml:space="preserve"> which is actually </w:t>
-      </w:r>
-      <w:r>
-        <w:rPr>
-          <w:rStyle w:val="VerbatimChar"/>
-        </w:rPr>
-        <w:t>practical0.R</w:t>
-      </w:r>
-      <w:r>
-        <w:rPr/>
-        <w:t xml:space="preserve"> and contains your script with R commands</w:t>
-      </w:r>
-    </w:p>
-    <w:p>
-      <w:pPr>
-        <w:pStyle w:val="FirstParagraph"/>
-        <w:rPr/>
-      </w:pPr>
-      <w:r>
-        <w:rPr/>
-        <w:t xml:space="preserve">Go back to RStudio and re-run your </w:t>
-      </w:r>
-      <w:r>
-        <w:rPr>
-          <w:rStyle w:val="VerbatimChar"/>
-        </w:rPr>
-        <w:t>read.csv</w:t>
-      </w:r>
-      <w:r>
-        <w:rPr/>
-        <w:t xml:space="preserve"> line.</w:t>
-      </w:r>
-    </w:p>
-    <w:p>
-      <w:pPr>
-        <w:pStyle w:val="BodyText"/>
-        <w:rPr/>
-      </w:pPr>
-      <w:r>
-        <w:rPr/>
-        <w:t xml:space="preserve">If it is successful, nothing will be displayed in the console, but in your Environment window (top right panel) you should see the table (data frame) </w:t>
-      </w:r>
-      <w:r>
-        <w:rPr>
-          <w:rStyle w:val="VerbatimChar"/>
-        </w:rPr>
-        <w:t>pract0_dat</w:t>
-      </w:r>
-      <w:r>
-        <w:rPr/>
-        <w:t xml:space="preserve"> listed, and when you run the </w:t>
-      </w:r>
-      <w:r>
-        <w:rPr>
-          <w:rStyle w:val="VerbatimChar"/>
-        </w:rPr>
-        <w:t>summary(pract0_dat)</w:t>
-      </w:r>
-      <w:r>
-        <w:rPr/>
-        <w:t xml:space="preserve"> and </w:t>
-      </w:r>
-      <w:r>
-        <w:rPr>
-          <w:rStyle w:val="VerbatimChar"/>
-        </w:rPr>
-        <w:t>mean(yield ~ soil, data = pract0_dat)</w:t>
-      </w:r>
-      <w:r>
-        <w:rPr/>
-        <w:t xml:space="preserve"> commands you should see:</w:t>
-      </w:r>
-    </w:p>
-    <w:p>
-      <w:pPr>
-        <w:pStyle w:val="SourceCode"/>
-        <w:rPr/>
-      </w:pPr>
-      <w:r>
-        <w:rPr>
-          <w:rStyle w:val="VerbatimChar"/>
-        </w:rPr>
-        <w:t xml:space="preserve">        </w:t>
-      </w:r>
-      <w:r>
-        <w:rPr>
-          <w:rStyle w:val="VerbatimChar"/>
-        </w:rPr>
-        <w:t xml:space="preserve">soil        yield      </w:t>
-      </w:r>
-      <w:r>
-        <w:rPr/>
-        <w:br/>
-      </w:r>
-      <w:r>
-        <w:rPr>
-          <w:rStyle w:val="VerbatimChar"/>
-        </w:rPr>
-        <w:t xml:space="preserve"> Length   :30   Min.   : 3.00  </w:t>
-      </w:r>
-      <w:r>
-        <w:rPr/>
-        <w:br/>
-      </w:r>
-      <w:r>
-        <w:rPr>
-          <w:rStyle w:val="VerbatimChar"/>
-        </w:rPr>
-        <w:t xml:space="preserve"> N.unique : 3   1st Qu.: 9.25  </w:t>
-      </w:r>
-      <w:r>
-        <w:rPr/>
-        <w:br/>
-      </w:r>
-      <w:r>
-        <w:rPr>
-          <w:rStyle w:val="VerbatimChar"/>
-        </w:rPr>
-        <w:t xml:space="preserve"> N.blank  : 0   Median :12.00  </w:t>
-      </w:r>
-      <w:r>
-        <w:rPr/>
-        <w:br/>
-      </w:r>
-      <w:r>
-        <w:rPr>
-          <w:rStyle w:val="VerbatimChar"/>
-        </w:rPr>
-        <w:t xml:space="preserve"> Min.nchar: 4   Mean   :11.90  </w:t>
-      </w:r>
-      <w:r>
-        <w:rPr/>
-        <w:br/>
-      </w:r>
-      <w:r>
-        <w:rPr>
-          <w:rStyle w:val="VerbatimChar"/>
-        </w:rPr>
-        <w:t xml:space="preserve"> Max.nchar: 4   3rd Qu.:14.75  </w:t>
-      </w:r>
-      <w:r>
-        <w:rPr/>
-        <w:br/>
-      </w:r>
-      <w:r>
-        <w:rPr>
-          <w:rStyle w:val="VerbatimChar"/>
-        </w:rPr>
-        <w:t xml:space="preserve">                Max.   :18.00  </w:t>
-      </w:r>
-    </w:p>
-    <w:p>
-      <w:pPr>
-        <w:pStyle w:val="SourceCode"/>
-        <w:rPr/>
-      </w:pPr>
-      <w:r>
-        <w:rPr>
-          <w:rStyle w:val="VerbatimChar"/>
-        </w:rPr>
-        <w:t xml:space="preserve">clay loam sand </w:t>
-      </w:r>
-      <w:r>
-        <w:rPr/>
-        <w:br/>
-      </w:r>
-      <w:r>
-        <w:rPr>
-          <w:rStyle w:val="VerbatimChar"/>
-        </w:rPr>
-        <w:t xml:space="preserve">11.5 14.3  9.9 </w:t>
-      </w:r>
-    </w:p>
-    <w:p>
-      <w:pPr>
-        <w:pStyle w:val="FirstParagraph"/>
-        <w:rPr/>
-      </w:pPr>
-      <w:r>
-        <w:rPr/>
-        <w:t xml:space="preserve">Success! </w:t>
-      </w:r>
-      <w:r>
-        <w:rPr>
-          <w:b/>
-          <w:bCs/>
-        </w:rPr>
-        <w:t>Important</w:t>
-      </w:r>
-      <w:r>
-        <w:rPr/>
-        <w:t xml:space="preserve"> Please speak to staff or the demonstrators know if you have problems with this step.</w:t>
-      </w:r>
-    </w:p>
-    <w:p>
-      <w:pPr>
-        <w:pStyle w:val="Heading2"/>
-        <w:rPr/>
-      </w:pPr>
-      <w:bookmarkStart w:id="33" w:name="where-to-store-your-csv-files"/>
-      <w:r>
-        <w:rPr/>
-        <w:t>6.1 Where to store your CSV files?</w:t>
-      </w:r>
-    </w:p>
-    <w:p>
-      <w:pPr>
-        <w:pStyle w:val="FirstParagraph"/>
-        <w:rPr/>
-      </w:pPr>
-      <w:r>
-        <w:rPr/>
-        <w:t xml:space="preserve">You can store them either in your main project folder or your </w:t>
-      </w:r>
-      <w:r>
-        <w:rPr>
-          <w:rStyle w:val="VerbatimChar"/>
-        </w:rPr>
-        <w:t>Data</w:t>
-      </w:r>
-      <w:r>
-        <w:rPr/>
-        <w:t xml:space="preserve"> folder but if you have lots of data files this can get confusing, so we recommend creating a folder called </w:t>
-      </w:r>
-      <w:r>
-        <w:rPr>
-          <w:rStyle w:val="VerbatimChar"/>
-          <w:b/>
-          <w:bCs/>
-        </w:rPr>
-        <w:t>Data</w:t>
-      </w:r>
-      <w:r>
-        <w:rPr/>
-        <w:t xml:space="preserve"> inside your </w:t>
-      </w:r>
-      <w:r>
-        <w:rPr>
-          <w:rStyle w:val="VerbatimChar"/>
-        </w:rPr>
-        <w:t>NES2504</w:t>
-      </w:r>
-      <w:r>
-        <w:rPr/>
-        <w:t xml:space="preserve"> project folder, and putting your CSV files there.</w:t>
-      </w:r>
-      <w:bookmarkEnd w:id="32"/>
-      <w:bookmarkEnd w:id="33"/>
-    </w:p>
-    <w:p>
-      <w:pPr>
-        <w:pStyle w:val="Heading1"/>
-        <w:rPr/>
-      </w:pPr>
-      <w:bookmarkStart w:id="34" w:name="__RefHeading___Toc2893_1119107993"/>
-      <w:bookmarkStart w:id="35" w:name="working-with-data"/>
-      <w:bookmarkEnd w:id="34"/>
-      <w:r>
-        <w:rPr/>
-        <w:t>7. Working with data</w:t>
-      </w:r>
-    </w:p>
-    <w:p>
-      <w:pPr>
-        <w:pStyle w:val="Heading2"/>
-        <w:rPr/>
-      </w:pPr>
-      <w:bookmarkStart w:id="36" w:name="using-r-as-a-calculator"/>
-      <w:r>
-        <w:rPr/>
-        <w:t>7.1 Using R as a calculator</w:t>
-      </w:r>
-    </w:p>
-    <w:p>
-      <w:pPr>
-        <w:pStyle w:val="FirstParagraph"/>
-        <w:rPr/>
-      </w:pPr>
-      <w:r>
-        <w:rPr/>
-        <w:t xml:space="preserve">You probably won’t use this very often, but you can easily enter values into the </w:t>
-      </w:r>
-      <w:r>
-        <w:rPr>
-          <w:b/>
-          <w:bCs/>
-        </w:rPr>
-        <w:t>Console</w:t>
-      </w:r>
-      <w:r>
-        <w:rPr/>
-        <w:t xml:space="preserve"> window if you need to do some quick arithmetic:</w:t>
-      </w:r>
-    </w:p>
-    <w:p>
-      <w:pPr>
-        <w:pStyle w:val="SourceCode"/>
-        <w:rPr/>
-      </w:pPr>
-      <w:r>
-        <w:rPr>
-          <w:rStyle w:val="DecValTok"/>
-        </w:rPr>
-        <w:t>7</w:t>
-      </w:r>
-      <w:r>
-        <w:rPr>
-          <w:rStyle w:val="NormalTok"/>
-        </w:rPr>
-        <w:t xml:space="preserve"> </w:t>
-      </w:r>
-      <w:r>
-        <w:rPr>
-          <w:rStyle w:val="SpecialCharTok"/>
-        </w:rPr>
-        <w:t>*</w:t>
-      </w:r>
-      <w:r>
-        <w:rPr>
-          <w:rStyle w:val="NormalTok"/>
-        </w:rPr>
-        <w:t xml:space="preserve"> </w:t>
-      </w:r>
-      <w:r>
-        <w:rPr>
-          <w:rStyle w:val="DecValTok"/>
-        </w:rPr>
-        <w:t>3</w:t>
-      </w:r>
-      <w:r>
-        <w:rPr/>
-        <w:br/>
-      </w:r>
-      <w:r>
-        <w:rPr>
-          <w:rStyle w:val="FunctionTok"/>
-        </w:rPr>
-        <w:t>log</w:t>
-      </w:r>
-      <w:r>
-        <w:rPr>
-          <w:rStyle w:val="NormalTok"/>
-        </w:rPr>
-        <w:t>(</w:t>
-      </w:r>
-      <w:r>
-        <w:rPr>
-          <w:rStyle w:val="DecValTok"/>
-        </w:rPr>
-        <w:t>24</w:t>
-      </w:r>
-      <w:r>
-        <w:rPr>
-          <w:rStyle w:val="NormalTok"/>
-        </w:rPr>
-        <w:t>)</w:t>
-      </w:r>
-      <w:r>
-        <w:rPr/>
-        <w:br/>
-      </w:r>
-      <w:r>
-        <w:rPr>
-          <w:rStyle w:val="DecValTok"/>
-        </w:rPr>
-        <w:t>4</w:t>
-      </w:r>
-      <w:r>
-        <w:rPr>
-          <w:rStyle w:val="SpecialCharTok"/>
-        </w:rPr>
-        <w:t>^</w:t>
-      </w:r>
-      <w:r>
-        <w:rPr>
-          <w:rStyle w:val="DecValTok"/>
-        </w:rPr>
-        <w:t>2</w:t>
-      </w:r>
-      <w:r>
-        <w:rPr/>
-        <w:br/>
-      </w:r>
-      <w:r>
-        <w:rPr>
-          <w:rStyle w:val="DecValTok"/>
-        </w:rPr>
-        <w:t>7</w:t>
-      </w:r>
-      <w:r>
-        <w:rPr>
-          <w:rStyle w:val="NormalTok"/>
-        </w:rPr>
-        <w:t xml:space="preserve"> </w:t>
-      </w:r>
-      <w:r>
-        <w:rPr>
-          <w:rStyle w:val="SpecialCharTok"/>
-        </w:rPr>
-        <w:t>/</w:t>
-      </w:r>
-      <w:r>
-        <w:rPr>
-          <w:rStyle w:val="NormalTok"/>
-        </w:rPr>
-        <w:t xml:space="preserve"> </w:t>
-      </w:r>
-      <w:r>
-        <w:rPr>
-          <w:rStyle w:val="DecValTok"/>
-        </w:rPr>
-        <w:t>3</w:t>
-      </w:r>
-      <w:r>
-        <w:rPr/>
-        <w:br/>
-      </w:r>
-      <w:r>
-        <w:rPr>
-          <w:rStyle w:val="NormalTok"/>
-        </w:rPr>
-        <w:t xml:space="preserve">pi </w:t>
-      </w:r>
-      <w:r>
-        <w:rPr>
-          <w:rStyle w:val="SpecialCharTok"/>
-        </w:rPr>
-        <w:t>*</w:t>
-      </w:r>
-      <w:r>
-        <w:rPr>
-          <w:rStyle w:val="NormalTok"/>
-        </w:rPr>
-        <w:t xml:space="preserve"> </w:t>
-      </w:r>
-      <w:r>
-        <w:rPr>
-          <w:rStyle w:val="DecValTok"/>
-        </w:rPr>
-        <w:t>3</w:t>
-      </w:r>
-      <w:r>
-        <w:rPr>
-          <w:rStyle w:val="NormalTok"/>
-        </w:rPr>
-        <w:t xml:space="preserve"> </w:t>
-      </w:r>
-      <w:r>
-        <w:rPr>
-          <w:rStyle w:val="SpecialCharTok"/>
-        </w:rPr>
-        <w:t>^</w:t>
-      </w:r>
-      <w:r>
-        <w:rPr>
-          <w:rStyle w:val="NormalTok"/>
-        </w:rPr>
-        <w:t xml:space="preserve"> </w:t>
-      </w:r>
-      <w:r>
-        <w:rPr>
-          <w:rStyle w:val="DecValTok"/>
-        </w:rPr>
-        <w:t>2</w:t>
-      </w:r>
-    </w:p>
-    <w:p>
-      <w:pPr>
-        <w:pStyle w:val="FirstParagraph"/>
-        <w:rPr/>
-      </w:pPr>
-      <w:r>
-        <w:rPr/>
-        <w:t xml:space="preserve">As you have typed the above into the Console window it isn’t saved after you finish today’s practical, but it doesn’t matter for some quick temporary calculations. Individual numbers, columns, rows, or tables of data, the results from calculations, statistical analyses and graphs are all </w:t>
-      </w:r>
-      <w:r>
-        <w:rPr>
-          <w:b/>
-          <w:bCs/>
-        </w:rPr>
-        <w:t>R objects</w:t>
-      </w:r>
-      <w:r>
-        <w:rPr/>
-        <w:t xml:space="preserve"> and the ones you have created in your current RStudio are shown in the top right </w:t>
-      </w:r>
-      <w:r>
-        <w:rPr>
-          <w:b/>
-          <w:bCs/>
-        </w:rPr>
-        <w:t>Environment</w:t>
-      </w:r>
-      <w:r>
-        <w:rPr/>
-        <w:t xml:space="preserve"> panel.</w:t>
-      </w:r>
-    </w:p>
-    <w:p>
-      <w:pPr>
-        <w:pStyle w:val="BodyText"/>
-        <w:rPr/>
-      </w:pPr>
-      <w:bookmarkStart w:id="37" w:name="using-r-as-a-calculator"/>
-      <w:r>
-        <w:rPr/>
-        <w:t>As mentioned before R is a programming language, as with any language there is some vocab that needs to be covered in order to help your understanding of what is being described.</w:t>
-      </w:r>
-      <w:bookmarkEnd w:id="37"/>
-    </w:p>
-    <w:p>
-      <w:pPr>
-        <w:pStyle w:val="Heading2"/>
-        <w:rPr/>
-      </w:pPr>
-      <w:bookmarkStart w:id="38" w:name="creating-objects"/>
-      <w:r>
-        <w:rPr/>
-        <w:t>7.2 Creating Objects</w:t>
-      </w:r>
-    </w:p>
-    <w:p>
-      <w:pPr>
-        <w:pStyle w:val="FirstParagraph"/>
-        <w:rPr/>
-      </w:pPr>
-      <w:r>
-        <w:rPr/>
-        <w:t xml:space="preserve">Although you have done some arithmetic above, it is much more useful to </w:t>
-      </w:r>
-      <w:r>
-        <w:rPr>
-          <w:b/>
-          <w:bCs/>
-        </w:rPr>
-        <w:t>assign</w:t>
-      </w:r>
-      <w:r>
-        <w:rPr/>
-        <w:t xml:space="preserve"> the results to an R object, so you can re-use them later. You do this using the assignment symbol </w:t>
-      </w:r>
-      <w:r>
-        <w:rPr>
-          <w:rStyle w:val="VerbatimChar"/>
-        </w:rPr>
-        <w:t>&lt;-</w:t>
-      </w:r>
-      <w:r>
-        <w:rPr/>
-        <w:t xml:space="preserve"> which looks like a left arrow. If you are having trouble finding the </w:t>
-      </w:r>
-      <w:r>
-        <w:rPr>
-          <w:rStyle w:val="VerbatimChar"/>
-        </w:rPr>
-        <w:t>&lt;</w:t>
-      </w:r>
-      <w:r>
-        <w:rPr/>
-        <w:t xml:space="preserve"> and </w:t>
-      </w:r>
-      <w:r>
-        <w:rPr>
-          <w:rStyle w:val="VerbatimChar"/>
-        </w:rPr>
-        <w:t>-</w:t>
-      </w:r>
-      <w:r>
-        <w:rPr/>
-        <w:t xml:space="preserve"> keys, a handy shortcut is to press</w:t>
-      </w:r>
-    </w:p>
-    <w:p>
-      <w:pPr>
-        <w:pStyle w:val="BodyText"/>
-        <w:rPr/>
-      </w:pPr>
-      <w:r>
-        <w:rPr/>
-        <w:t xml:space="preserve">typing Alt + - (push Alt at the same time as the - key) will write </w:t>
-      </w:r>
-      <w:r>
-        <w:rPr>
-          <w:rStyle w:val="VerbatimChar"/>
-        </w:rPr>
-        <w:t>&lt;-</w:t>
-      </w:r>
-      <w:r>
-        <w:rPr/>
-        <w:t xml:space="preserve"> in a single keystroke.</w:t>
-      </w:r>
-    </w:p>
-    <w:p>
-      <w:pPr>
-        <w:pStyle w:val="BodyText"/>
-        <w:rPr/>
-      </w:pPr>
-      <w:r>
-        <w:rPr/>
-        <w:t xml:space="preserve">Now you can </w:t>
-      </w:r>
-      <w:r>
-        <w:rPr>
-          <w:i/>
-          <w:iCs/>
-        </w:rPr>
-        <w:t>assign</w:t>
-      </w:r>
-      <w:r>
-        <w:rPr/>
-        <w:t xml:space="preserve"> a value(s) to an </w:t>
-      </w:r>
-      <w:r>
-        <w:rPr>
-          <w:i/>
-          <w:iCs/>
-        </w:rPr>
-        <w:t>object</w:t>
-      </w:r>
-      <w:r>
-        <w:rPr/>
-        <w:t xml:space="preserve"> so that R remembers it. You need to come up with a name for your object. Come up with a good name!</w:t>
-      </w:r>
-    </w:p>
-    <w:p>
-      <w:pPr>
-        <w:pStyle w:val="BodyText"/>
-        <w:rPr/>
-      </w:pPr>
-      <w:r>
-        <w:rPr/>
-        <w:t>Good names:</w:t>
+        <w:t>my_height</w:t>
       </w:r>
     </w:p>
     <w:p>
@@ -4821,7 +4889,7 @@
         <w:rPr>
           <w:rStyle w:val="VerbatimChar"/>
         </w:rPr>
-        <w:t>my_height</w:t>
+        <w:t>bird_weights</w:t>
       </w:r>
     </w:p>
     <w:p>
@@ -4837,7 +4905,17 @@
         <w:rPr>
           <w:rStyle w:val="VerbatimChar"/>
         </w:rPr>
-        <w:t>bird_weights</w:t>
+        <w:t>bacteria_growth</w:t>
+      </w:r>
+    </w:p>
+    <w:p>
+      <w:pPr>
+        <w:pStyle w:val="FirstParagraph"/>
+        <w:rPr/>
+      </w:pPr>
+      <w:r>
+        <w:rPr/>
+        <w:t>Poor names:</w:t>
       </w:r>
     </w:p>
     <w:p>
@@ -4853,17 +4931,11 @@
         <w:rPr>
           <w:rStyle w:val="VerbatimChar"/>
         </w:rPr>
-        <w:t>bacteria_growth</w:t>
-      </w:r>
-    </w:p>
-    <w:p>
-      <w:pPr>
-        <w:pStyle w:val="FirstParagraph"/>
-        <w:rPr/>
-      </w:pPr>
-      <w:r>
-        <w:rPr/>
-        <w:t>Poor names:</w:t>
+        <w:t>my_dat</w:t>
+      </w:r>
+      <w:r>
+        <w:rPr/>
+        <w:t xml:space="preserve"> You will soon forget what this contains</w:t>
       </w:r>
     </w:p>
     <w:p>
@@ -4879,11 +4951,51 @@
         <w:rPr>
           <w:rStyle w:val="VerbatimChar"/>
         </w:rPr>
-        <w:t>my_dat</w:t>
-      </w:r>
-      <w:r>
-        <w:rPr/>
-        <w:t xml:space="preserve"> You will soon forget what this contains</w:t>
+        <w:t>Bird_wght</w:t>
+      </w:r>
+      <w:r>
+        <w:rPr/>
+        <w:t xml:space="preserve"> You will forget the upper-case </w:t>
+      </w:r>
+      <w:r>
+        <w:rPr>
+          <w:rStyle w:val="VerbatimChar"/>
+        </w:rPr>
+        <w:t>B</w:t>
+      </w:r>
+      <w:r>
+        <w:rPr/>
+        <w:t xml:space="preserve"> and whether it is </w:t>
+      </w:r>
+      <w:r>
+        <w:rPr>
+          <w:rStyle w:val="VerbatimChar"/>
+        </w:rPr>
+        <w:t>wght</w:t>
+      </w:r>
+      <w:r>
+        <w:rPr/>
+        <w:t xml:space="preserve">, </w:t>
+      </w:r>
+      <w:r>
+        <w:rPr>
+          <w:rStyle w:val="VerbatimChar"/>
+        </w:rPr>
+        <w:t>Wght</w:t>
+      </w:r>
+      <w:r>
+        <w:rPr/>
+        <w:t xml:space="preserve">, </w:t>
+      </w:r>
+      <w:r>
+        <w:rPr>
+          <w:rStyle w:val="VerbatimChar"/>
+        </w:rPr>
+        <w:t>weight</w:t>
+      </w:r>
+      <w:r>
+        <w:rPr/>
+        <w:t xml:space="preserve"> etc.</w:t>
       </w:r>
     </w:p>
     <w:p>
@@ -4892,66 +5004,6 @@
         <w:numPr>
           <w:ilvl w:val="0"/>
           <w:numId w:val="65"/>
-        </w:numPr>
-        <w:rPr/>
-      </w:pPr>
-      <w:r>
-        <w:rPr>
-          <w:rStyle w:val="VerbatimChar"/>
-        </w:rPr>
-        <w:t>Bird_wght</w:t>
-      </w:r>
-      <w:r>
-        <w:rPr/>
-        <w:t xml:space="preserve"> You will forget the upper-case </w:t>
-      </w:r>
-      <w:r>
-        <w:rPr>
-          <w:rStyle w:val="VerbatimChar"/>
-        </w:rPr>
-        <w:t>B</w:t>
-      </w:r>
-      <w:r>
-        <w:rPr/>
-        <w:t xml:space="preserve"> and whether it is </w:t>
-      </w:r>
-      <w:r>
-        <w:rPr>
-          <w:rStyle w:val="VerbatimChar"/>
-        </w:rPr>
-        <w:t>wght</w:t>
-      </w:r>
-      <w:r>
-        <w:rPr/>
-        <w:t xml:space="preserve">, </w:t>
-      </w:r>
-      <w:r>
-        <w:rPr>
-          <w:rStyle w:val="VerbatimChar"/>
-        </w:rPr>
-        <w:t>Wght</w:t>
-      </w:r>
-      <w:r>
-        <w:rPr/>
-        <w:t xml:space="preserve">, </w:t>
-      </w:r>
-      <w:r>
-        <w:rPr>
-          <w:rStyle w:val="VerbatimChar"/>
-        </w:rPr>
-        <w:t>weight</w:t>
-      </w:r>
-      <w:r>
-        <w:rPr/>
-        <w:t xml:space="preserve"> etc.</w:t>
-      </w:r>
-    </w:p>
-    <w:p>
-      <w:pPr>
-        <w:pStyle w:val="Compact"/>
-        <w:numPr>
-          <w:ilvl w:val="0"/>
-          <w:numId w:val="66"/>
         </w:numPr>
         <w:rPr/>
       </w:pPr>
@@ -7491,6 +7543,27 @@
         <w:pStyle w:val="Compact"/>
         <w:numPr>
           <w:ilvl w:val="0"/>
+          <w:numId w:val="66"/>
+        </w:numPr>
+        <w:rPr/>
+      </w:pPr>
+      <w:r>
+        <w:rPr>
+          <w:b/>
+          <w:bCs/>
+        </w:rPr>
+        <w:t>goal</w:t>
+      </w:r>
+      <w:r>
+        <w:rPr/>
+        <w:t xml:space="preserve"> = What you want to do; a statistical summary, data analysis, or graph</w:t>
+      </w:r>
+    </w:p>
+    <w:p>
+      <w:pPr>
+        <w:pStyle w:val="Compact"/>
+        <w:numPr>
+          <w:ilvl w:val="0"/>
           <w:numId w:val="67"/>
         </w:numPr>
         <w:rPr/>
@@ -7500,11 +7573,22 @@
           <w:b/>
           <w:bCs/>
         </w:rPr>
-        <w:t>goal</w:t>
-      </w:r>
-      <w:r>
-        <w:rPr/>
-        <w:t xml:space="preserve"> = What you want to do; a statistical summary, data analysis, or graph</w:t>
+        <w:t>y</w:t>
+      </w:r>
+      <w:r>
+        <w:rPr/>
+        <w:t xml:space="preserve"> = the name of the column containing the </w:t>
+      </w:r>
+      <w:r>
+        <w:rPr>
+          <w:b/>
+          <w:bCs/>
+        </w:rPr>
+        <w:t>response</w:t>
+      </w:r>
+      <w:r>
+        <w:rPr/>
+        <w:t xml:space="preserve"> variable</w:t>
       </w:r>
     </w:p>
     <w:p>
@@ -7521,18 +7605,18 @@
           <w:b/>
           <w:bCs/>
         </w:rPr>
-        <w:t>y</w:t>
-      </w:r>
-      <w:r>
-        <w:rPr/>
-        <w:t xml:space="preserve"> = the name of the column containing the </w:t>
+        <w:t>x</w:t>
+      </w:r>
+      <w:r>
+        <w:rPr/>
+        <w:t xml:space="preserve"> = the name of the column containing an </w:t>
       </w:r>
       <w:r>
         <w:rPr>
           <w:b/>
           <w:bCs/>
         </w:rPr>
-        <w:t>response</w:t>
+        <w:t>explanatory</w:t>
       </w:r>
       <w:r>
         <w:rPr/>
@@ -7553,49 +7637,17 @@
           <w:b/>
           <w:bCs/>
         </w:rPr>
-        <w:t>x</w:t>
-      </w:r>
-      <w:r>
-        <w:rPr/>
-        <w:t xml:space="preserve"> = the name of the column containing an </w:t>
+        <w:t>mydata</w:t>
+      </w:r>
+      <w:r>
+        <w:rPr/>
+        <w:t xml:space="preserve"> = name of your table of data, known in R as a </w:t>
       </w:r>
       <w:r>
         <w:rPr>
           <w:b/>
           <w:bCs/>
         </w:rPr>
-        <w:t>explanatory</w:t>
-      </w:r>
-      <w:r>
-        <w:rPr/>
-        <w:t xml:space="preserve"> variable</w:t>
-      </w:r>
-    </w:p>
-    <w:p>
-      <w:pPr>
-        <w:pStyle w:val="Compact"/>
-        <w:numPr>
-          <w:ilvl w:val="0"/>
-          <w:numId w:val="70"/>
-        </w:numPr>
-        <w:rPr/>
-      </w:pPr>
-      <w:r>
-        <w:rPr>
-          <w:b/>
-          <w:bCs/>
-        </w:rPr>
-        <w:t>mydata</w:t>
-      </w:r>
-      <w:r>
-        <w:rPr/>
-        <w:t xml:space="preserve"> = name of your table of data, known in R as a </w:t>
-      </w:r>
-      <w:r>
-        <w:rPr>
-          <w:b/>
-          <w:bCs/>
-        </w:rPr>
         <w:t>data.frame</w:t>
       </w:r>
     </w:p>
@@ -7812,7 +7864,7 @@
         <w:pStyle w:val="Heading1"/>
         <w:rPr/>
       </w:pPr>
-      <w:bookmarkStart w:id="44" w:name="__RefHeading___Toc2895_1119107993"/>
+      <w:bookmarkStart w:id="44" w:name="__RefHeading___Toc2897_2767856350"/>
       <w:bookmarkStart w:id="45" w:name="importing-and-exporting-data"/>
       <w:bookmarkEnd w:id="44"/>
       <w:r>
@@ -8147,7 +8199,7 @@
         <w:pStyle w:val="Heading1"/>
         <w:rPr/>
       </w:pPr>
-      <w:bookmarkStart w:id="54" w:name="__RefHeading___Toc2897_1119107993"/>
+      <w:bookmarkStart w:id="54" w:name="__RefHeading___Toc2899_2767856350"/>
       <w:bookmarkStart w:id="55" w:name="getting-help"/>
       <w:bookmarkEnd w:id="54"/>
       <w:r>
@@ -8383,7 +8435,7 @@
         <w:pStyle w:val="Heading1"/>
         <w:rPr/>
       </w:pPr>
-      <w:bookmarkStart w:id="56" w:name="__RefHeading___Toc2899_1119107993"/>
+      <w:bookmarkStart w:id="56" w:name="__RefHeading___Toc2901_2767856350"/>
       <w:bookmarkStart w:id="57" w:name="final-steps-before-you-finish"/>
       <w:bookmarkEnd w:id="56"/>
       <w:r>
@@ -9732,19 +9784,16 @@
         </w:rPr>
         <w:t>)</w:t>
       </w:r>
-      <w:bookmarkEnd w:id="57"/>
-    </w:p>
-    <w:p>
-      <w:pPr>
-        <w:pStyle w:val="Heading1"/>
-        <w:rPr/>
-      </w:pPr>
-      <w:bookmarkStart w:id="58" w:name="__RefHeading___Toc2901_1119107993"/>
-      <w:bookmarkStart w:id="59" w:name="take-home-messages-from-todays-practical"/>
-      <w:bookmarkEnd w:id="58"/>
-      <w:r>
-        <w:rPr/>
-        <w:t>11. Take home messages from today’s practical</w:t>
+    </w:p>
+    <w:p>
+      <w:pPr>
+        <w:pStyle w:val="Heading2"/>
+        <w:rPr/>
+      </w:pPr>
+      <w:bookmarkStart w:id="58" w:name="check-your-nes2504-folder-contents"/>
+      <w:r>
+        <w:rPr/>
+        <w:t>10.1 Check your NES2504 folder contents</w:t>
       </w:r>
     </w:p>
     <w:p>
@@ -9754,143 +9803,7 @@
       </w:pPr>
       <w:r>
         <w:rPr/>
-        <w:t>R and RStudio can be intimidating at first, but take your time and understand its structure. In particular:</w:t>
-      </w:r>
-    </w:p>
-    <w:p>
-      <w:pPr>
-        <w:pStyle w:val="Compact"/>
-        <w:numPr>
-          <w:ilvl w:val="0"/>
-          <w:numId w:val="71"/>
-        </w:numPr>
-        <w:rPr/>
-      </w:pPr>
-      <w:r>
-        <w:rPr/>
-        <w:t>Always use an RStudio project as it makes file management simpler. Create a separate project for each Module in your degree where you have to analyse data</w:t>
-      </w:r>
-    </w:p>
-    <w:p>
-      <w:pPr>
-        <w:pStyle w:val="Compact"/>
-        <w:numPr>
-          <w:ilvl w:val="0"/>
-          <w:numId w:val="72"/>
-        </w:numPr>
-        <w:rPr/>
-      </w:pPr>
-      <w:r>
-        <w:rPr/>
-        <w:t xml:space="preserve">If you download Data files from the internet, you need to move them from the default </w:t>
-      </w:r>
-      <w:r>
-        <w:rPr>
-          <w:b/>
-          <w:bCs/>
-        </w:rPr>
-        <w:t>Downloads</w:t>
-      </w:r>
-      <w:r>
-        <w:rPr/>
-        <w:t xml:space="preserve"> folder to the project </w:t>
-      </w:r>
-      <w:r>
-        <w:rPr>
-          <w:b/>
-          <w:bCs/>
-        </w:rPr>
-        <w:t>Data</w:t>
-      </w:r>
-      <w:r>
-        <w:rPr/>
-        <w:t xml:space="preserve"> folder</w:t>
-      </w:r>
-    </w:p>
-    <w:p>
-      <w:pPr>
-        <w:pStyle w:val="Compact"/>
-        <w:numPr>
-          <w:ilvl w:val="0"/>
-          <w:numId w:val="73"/>
-        </w:numPr>
-        <w:rPr/>
-      </w:pPr>
-      <w:r>
-        <w:rPr/>
-        <w:t>Remember to convert conventional Microsoft Excel files to CSV files before importing them into RStudio</w:t>
-      </w:r>
-    </w:p>
-    <w:p>
-      <w:pPr>
-        <w:pStyle w:val="Compact"/>
-        <w:numPr>
-          <w:ilvl w:val="0"/>
-          <w:numId w:val="74"/>
-        </w:numPr>
-        <w:rPr/>
-      </w:pPr>
-      <w:r>
-        <w:rPr/>
-        <w:t xml:space="preserve">The R “script”, </w:t>
-      </w:r>
-      <w:r>
-        <w:rPr>
-          <w:rStyle w:val="VerbatimChar"/>
-        </w:rPr>
-        <w:t>practical0.R</w:t>
-      </w:r>
-      <w:r>
-        <w:rPr/>
-        <w:t xml:space="preserve"> is all you need to save. Add lots of comments so it is easy to understand months later.</w:t>
-      </w:r>
-    </w:p>
-    <w:p>
-      <w:pPr>
-        <w:pStyle w:val="Compact"/>
-        <w:numPr>
-          <w:ilvl w:val="0"/>
-          <w:numId w:val="75"/>
-        </w:numPr>
-        <w:rPr/>
-      </w:pPr>
-      <w:r>
-        <w:rPr/>
-        <w:t xml:space="preserve">You can run lines sequentially from top to bottom in your </w:t>
-      </w:r>
-      <w:r>
-        <w:rPr>
-          <w:rStyle w:val="VerbatimChar"/>
-        </w:rPr>
-        <w:t>practical0.R</w:t>
-      </w:r>
-      <w:r>
-        <w:rPr/>
-        <w:t xml:space="preserve"> script to regenerate your entire workflow automatically</w:t>
-      </w:r>
-      <w:bookmarkEnd w:id="59"/>
-    </w:p>
-    <w:p>
-      <w:pPr>
-        <w:pStyle w:val="Heading1"/>
-        <w:rPr/>
-      </w:pPr>
-      <w:bookmarkStart w:id="60" w:name="__RefHeading___Toc2903_1119107993"/>
-      <w:bookmarkStart w:id="61" w:name="in-your-own-time"/>
-      <w:bookmarkEnd w:id="60"/>
-      <w:r>
-        <w:rPr/>
-        <w:t>12. In your own time</w:t>
-      </w:r>
-    </w:p>
-    <w:p>
-      <w:pPr>
-        <w:pStyle w:val="FirstParagraph"/>
-        <w:rPr/>
-      </w:pPr>
-      <w:r>
-        <w:rPr/>
-        <w:t>Sometimes Microsoft Excel files can look clear and attractive, but then prove difficult to use inside R. Download the ‘awkward.xlsx’ Excel file from Canvas and open it in Excel. It contains seed production weights, and the plant root sizes, under two different grazing regimes. At first sight it looks fine, with 4 columns of data for the root lengths and seed weights under the two grazing regimes:</w:t>
+        <w:t>Double-check the contents of your data analysis folder (which might be NES2303 or NES2504 depending on how you have labelled it). Open it in Windows File Manager:</w:t>
       </w:r>
     </w:p>
     <w:p>
@@ -9902,7 +9815,7 @@
         <w:rPr/>
         <w:drawing>
           <wp:inline distT="0" distB="0" distL="0" distR="0">
-            <wp:extent cx="3962400" cy="6604000"/>
+            <wp:extent cx="5334000" cy="2049780"/>
             <wp:effectExtent l="0" t="0" r="0" b="0"/>
             <wp:docPr id="19" name="Image19" descr=""/>
             <wp:cNvGraphicFramePr>
@@ -9926,7 +9839,7 @@
                   <pic:spPr bwMode="auto">
                     <a:xfrm>
                       <a:off x="0" y="0"/>
-                      <a:ext cx="3962400" cy="6604000"/>
+                      <a:ext cx="5334000" cy="2049780"/>
                     </a:xfrm>
                     <a:prstGeom prst="rect">
                       <a:avLst/>
@@ -9946,76 +9859,32 @@
       </w:pPr>
       <w:r>
         <w:rPr/>
-        <w:t xml:space="preserve">As usual, export it from Excel using the ‘Save As’ option as a CSV file inside your </w:t>
-      </w:r>
-      <w:r>
-        <w:rPr>
-          <w:b/>
-          <w:bCs/>
-        </w:rPr>
-        <w:t>NES2504/Data</w:t>
-      </w:r>
-      <w:r>
-        <w:rPr/>
-        <w:t xml:space="preserve"> folder. Now add the necessary R code, to import your CSV file:</w:t>
-      </w:r>
-    </w:p>
-    <w:p>
-      <w:pPr>
-        <w:pStyle w:val="SourceCode"/>
-        <w:rPr/>
-      </w:pPr>
-      <w:r>
-        <w:rPr>
-          <w:rStyle w:val="CommentTok"/>
-        </w:rPr>
-        <w:t># Import CSV from badly structured Excel file</w:t>
-      </w:r>
-      <w:r>
-        <w:rPr/>
-        <w:br/>
-      </w:r>
-      <w:r>
-        <w:rPr>
-          <w:rStyle w:val="NormalTok"/>
-        </w:rPr>
-        <w:t xml:space="preserve">seeds_dat </w:t>
-      </w:r>
-      <w:r>
-        <w:rPr>
-          <w:rStyle w:val="OtherTok"/>
-        </w:rPr>
-        <w:t>&lt;-</w:t>
-      </w:r>
-      <w:r>
-        <w:rPr>
-          <w:rStyle w:val="NormalTok"/>
-        </w:rPr>
-        <w:t xml:space="preserve"> </w:t>
-      </w:r>
-      <w:r>
-        <w:rPr>
-          <w:rStyle w:val="FunctionTok"/>
-        </w:rPr>
-        <w:t>read.csv</w:t>
-      </w:r>
-      <w:r>
-        <w:rPr>
-          <w:rStyle w:val="NormalTok"/>
-        </w:rPr>
-        <w:t>(</w:t>
-      </w:r>
-      <w:r>
-        <w:rPr>
-          <w:rStyle w:val="StringTok"/>
-        </w:rPr>
-        <w:t>"Data/awkward.csv"</w:t>
-      </w:r>
-      <w:r>
-        <w:rPr>
-          <w:rStyle w:val="NormalTok"/>
-        </w:rPr>
-        <w:t>)</w:t>
+        <w:t xml:space="preserve">You should see the name of your RStudio Project File (NES2504), the name of your R script (practical0) and your </w:t>
+      </w:r>
+      <w:r>
+        <w:rPr>
+          <w:rStyle w:val="VerbatimChar"/>
+        </w:rPr>
+        <w:t>Data</w:t>
+      </w:r>
+      <w:r>
+        <w:rPr/>
+        <w:t xml:space="preserve"> folder. This should contain your CSV data file from today, as well as its Excel equivalent.</w:t>
+      </w:r>
+      <w:bookmarkEnd w:id="57"/>
+      <w:bookmarkEnd w:id="58"/>
+    </w:p>
+    <w:p>
+      <w:pPr>
+        <w:pStyle w:val="Heading1"/>
+        <w:rPr/>
+      </w:pPr>
+      <w:bookmarkStart w:id="59" w:name="__RefHeading___Toc2903_2767856350"/>
+      <w:bookmarkStart w:id="60" w:name="take-home-messages-from-todays-practical"/>
+      <w:bookmarkEnd w:id="59"/>
+      <w:r>
+        <w:rPr/>
+        <w:t>11. Take home messages from today’s practical</w:t>
       </w:r>
     </w:p>
     <w:p>
@@ -10025,451 +9894,7 @@
       </w:pPr>
       <w:r>
         <w:rPr/>
-        <w:t xml:space="preserve">No errors, so presumably everything is OK? Not so fast! Add a </w:t>
-      </w:r>
-      <w:r>
-        <w:rPr>
-          <w:rStyle w:val="VerbatimChar"/>
-        </w:rPr>
-        <w:t>summary</w:t>
-      </w:r>
-      <w:r>
-        <w:rPr/>
-        <w:t xml:space="preserve"> command to have a look at your data and you’ll spot there is a problem:</w:t>
-      </w:r>
-    </w:p>
-    <w:p>
-      <w:pPr>
-        <w:pStyle w:val="SourceCode"/>
-        <w:rPr/>
-      </w:pPr>
-      <w:r>
-        <w:rPr>
-          <w:rStyle w:val="CommentTok"/>
-        </w:rPr>
-        <w:t># Import CSV from badly structured Excel file</w:t>
-      </w:r>
-      <w:r>
-        <w:rPr/>
-        <w:br/>
-      </w:r>
-      <w:r>
-        <w:rPr>
-          <w:rStyle w:val="NormalTok"/>
-        </w:rPr>
-        <w:t xml:space="preserve">seeds_dat </w:t>
-      </w:r>
-      <w:r>
-        <w:rPr>
-          <w:rStyle w:val="OtherTok"/>
-        </w:rPr>
-        <w:t>&lt;-</w:t>
-      </w:r>
-      <w:r>
-        <w:rPr>
-          <w:rStyle w:val="NormalTok"/>
-        </w:rPr>
-        <w:t xml:space="preserve"> </w:t>
-      </w:r>
-      <w:r>
-        <w:rPr>
-          <w:rStyle w:val="FunctionTok"/>
-        </w:rPr>
-        <w:t>read.csv</w:t>
-      </w:r>
-      <w:r>
-        <w:rPr>
-          <w:rStyle w:val="NormalTok"/>
-        </w:rPr>
-        <w:t>(</w:t>
-      </w:r>
-      <w:r>
-        <w:rPr>
-          <w:rStyle w:val="StringTok"/>
-        </w:rPr>
-        <w:t>"Data/awkward.csv"</w:t>
-      </w:r>
-      <w:r>
-        <w:rPr>
-          <w:rStyle w:val="NormalTok"/>
-        </w:rPr>
-        <w:t>)</w:t>
-      </w:r>
-      <w:r>
-        <w:rPr/>
-        <w:br/>
-        <w:br/>
-      </w:r>
-      <w:r>
-        <w:rPr>
-          <w:rStyle w:val="CommentTok"/>
-        </w:rPr>
-        <w:t># Check data format with summary</w:t>
-      </w:r>
-      <w:r>
-        <w:rPr/>
-        <w:br/>
-      </w:r>
-      <w:r>
-        <w:rPr>
-          <w:rStyle w:val="FunctionTok"/>
-        </w:rPr>
-        <w:t>summary</w:t>
-      </w:r>
-      <w:r>
-        <w:rPr>
-          <w:rStyle w:val="NormalTok"/>
-        </w:rPr>
-        <w:t>(seeds_dat)</w:t>
-      </w:r>
-    </w:p>
-    <w:p>
-      <w:pPr>
-        <w:pStyle w:val="SourceCode"/>
-        <w:rPr/>
-      </w:pPr>
-      <w:r>
-        <w:rPr>
-          <w:rStyle w:val="VerbatimChar"/>
-        </w:rPr>
-        <w:t xml:space="preserve">      </w:t>
-      </w:r>
-      <w:r>
-        <w:rPr>
-          <w:rStyle w:val="VerbatimChar"/>
-        </w:rPr>
-        <w:t xml:space="preserve">Ungrazed          X            Grazed          X.1    </w:t>
-      </w:r>
-      <w:r>
-        <w:rPr/>
-        <w:br/>
-      </w:r>
-      <w:r>
-        <w:rPr>
-          <w:rStyle w:val="VerbatimChar"/>
-        </w:rPr>
-        <w:t xml:space="preserve"> Length   :21   Length   :21   Length   :21   Length   :21  </w:t>
-      </w:r>
-      <w:r>
-        <w:rPr/>
-        <w:br/>
-      </w:r>
-      <w:r>
-        <w:rPr>
-          <w:rStyle w:val="VerbatimChar"/>
-        </w:rPr>
-        <w:t xml:space="preserve"> N.unique :21   N.unique :21   N.unique :21   N.unique :21  </w:t>
-      </w:r>
-      <w:r>
-        <w:rPr/>
-        <w:br/>
-      </w:r>
-      <w:r>
-        <w:rPr>
-          <w:rStyle w:val="VerbatimChar"/>
-        </w:rPr>
-        <w:t xml:space="preserve"> N.blank  : 0   N.blank  : 0   N.blank  : 0   N.blank  : 0  </w:t>
-      </w:r>
-      <w:r>
-        <w:rPr/>
-        <w:br/>
-      </w:r>
-      <w:r>
-        <w:rPr>
-          <w:rStyle w:val="VerbatimChar"/>
-        </w:rPr>
-        <w:t xml:space="preserve"> Min.nchar: 4   Min.nchar: 5   Min.nchar: 4   Min.nchar: 4  </w:t>
-      </w:r>
-      <w:r>
-        <w:rPr/>
-        <w:br/>
-      </w:r>
-      <w:r>
-        <w:rPr>
-          <w:rStyle w:val="VerbatimChar"/>
-        </w:rPr>
-        <w:t xml:space="preserve"> Max.nchar: 5   Max.nchar: 5   Max.nchar: 6   Max.nchar: 6  </w:t>
-      </w:r>
-    </w:p>
-    <w:p>
-      <w:pPr>
-        <w:pStyle w:val="FirstParagraph"/>
-        <w:rPr/>
-      </w:pPr>
-      <w:r>
-        <w:rPr/>
-        <w:t xml:space="preserve">You seem to have gained 2 mysterious columns called </w:t>
-      </w:r>
-      <w:r>
-        <w:rPr>
-          <w:b/>
-          <w:bCs/>
-        </w:rPr>
-        <w:t>X</w:t>
-      </w:r>
-      <w:r>
-        <w:rPr/>
-        <w:t xml:space="preserve"> and </w:t>
-      </w:r>
-      <w:r>
-        <w:rPr>
-          <w:b/>
-          <w:bCs/>
-        </w:rPr>
-        <w:t>X.2</w:t>
-      </w:r>
-      <w:r>
-        <w:rPr/>
-        <w:t xml:space="preserve"> which aren’t in the original dataset, and there is no indication of which columns are </w:t>
-      </w:r>
-      <w:r>
-        <w:rPr>
-          <w:rStyle w:val="VerbatimChar"/>
-        </w:rPr>
-        <w:t>Root</w:t>
-      </w:r>
-      <w:r>
-        <w:rPr/>
-        <w:t xml:space="preserve"> or </w:t>
-      </w:r>
-      <w:r>
-        <w:rPr>
-          <w:rStyle w:val="VerbatimChar"/>
-        </w:rPr>
-        <w:t>Fruit</w:t>
-      </w:r>
-      <w:r>
-        <w:rPr/>
-        <w:t xml:space="preserve">. Also look carefully at the </w:t>
-      </w:r>
-      <w:r>
-        <w:rPr>
-          <w:rStyle w:val="VerbatimChar"/>
-        </w:rPr>
-        <w:t>summary()</w:t>
-      </w:r>
-      <w:r>
-        <w:rPr/>
-        <w:t xml:space="preserve"> results: there are no means, medians, min, or max etc. as you would expect. What has gone wrong? Let’s look at the first few lines using the </w:t>
-      </w:r>
-      <w:r>
-        <w:rPr>
-          <w:rStyle w:val="VerbatimChar"/>
-        </w:rPr>
-        <w:t>head()</w:t>
-      </w:r>
-      <w:r>
-        <w:rPr/>
-        <w:t xml:space="preserve"> function:</w:t>
-      </w:r>
-    </w:p>
-    <w:p>
-      <w:pPr>
-        <w:pStyle w:val="SourceCode"/>
-        <w:rPr/>
-      </w:pPr>
-      <w:r>
-        <w:rPr>
-          <w:rStyle w:val="FunctionTok"/>
-        </w:rPr>
-        <w:t>head</w:t>
-      </w:r>
-      <w:r>
-        <w:rPr>
-          <w:rStyle w:val="NormalTok"/>
-        </w:rPr>
-        <w:t>(seeds_dat)</w:t>
-      </w:r>
-    </w:p>
-    <w:p>
-      <w:pPr>
-        <w:pStyle w:val="SourceCode"/>
-        <w:rPr/>
-      </w:pPr>
-      <w:r>
-        <w:rPr>
-          <w:rStyle w:val="VerbatimChar"/>
-        </w:rPr>
-        <w:t xml:space="preserve">  </w:t>
-      </w:r>
-      <w:r>
-        <w:rPr>
-          <w:rStyle w:val="VerbatimChar"/>
-        </w:rPr>
-        <w:t>Ungrazed     X Grazed    X.1</w:t>
-      </w:r>
-      <w:r>
-        <w:rPr/>
-        <w:br/>
-      </w:r>
-      <w:r>
-        <w:rPr>
-          <w:rStyle w:val="VerbatimChar"/>
-        </w:rPr>
-        <w:t>1     Root Fruit   Root  Fruit</w:t>
-      </w:r>
-      <w:r>
-        <w:rPr/>
-        <w:br/>
-      </w:r>
-      <w:r>
-        <w:rPr>
-          <w:rStyle w:val="VerbatimChar"/>
-        </w:rPr>
-        <w:t>2    6.225 59.77 10.253 116.05</w:t>
-      </w:r>
-      <w:r>
-        <w:rPr/>
-        <w:br/>
-      </w:r>
-      <w:r>
-        <w:rPr>
-          <w:rStyle w:val="VerbatimChar"/>
-        </w:rPr>
-        <w:t>3    6.487 60.98  6.958  38.94</w:t>
-      </w:r>
-      <w:r>
-        <w:rPr/>
-        <w:br/>
-      </w:r>
-      <w:r>
-        <w:rPr>
-          <w:rStyle w:val="VerbatimChar"/>
-        </w:rPr>
-        <w:t>4    4.919 14.73  8.001  60.77</w:t>
-      </w:r>
-      <w:r>
-        <w:rPr/>
-        <w:br/>
-      </w:r>
-      <w:r>
-        <w:rPr>
-          <w:rStyle w:val="VerbatimChar"/>
-        </w:rPr>
-        <w:t>5     5.13 19.28  9.039  84.37</w:t>
-      </w:r>
-      <w:r>
-        <w:rPr/>
-        <w:br/>
-      </w:r>
-      <w:r>
-        <w:rPr>
-          <w:rStyle w:val="VerbatimChar"/>
-        </w:rPr>
-        <w:t>6    5.417 34.25   8.91  70.11</w:t>
-      </w:r>
-    </w:p>
-    <w:p>
-      <w:pPr>
-        <w:pStyle w:val="FirstParagraph"/>
-        <w:rPr/>
-      </w:pPr>
-      <w:r>
-        <w:rPr/>
-        <w:t xml:space="preserve">Now the problem is clear. There were of course </w:t>
-      </w:r>
-      <w:r>
-        <w:rPr>
-          <w:b/>
-          <w:bCs/>
-        </w:rPr>
-        <w:t>two</w:t>
-      </w:r>
-      <w:r>
-        <w:rPr/>
-        <w:t xml:space="preserve"> header rows in your Excel file; the </w:t>
-      </w:r>
-      <w:r>
-        <w:rPr>
-          <w:rStyle w:val="VerbatimChar"/>
-        </w:rPr>
-        <w:t>read.csv()</w:t>
-      </w:r>
-      <w:r>
-        <w:rPr/>
-        <w:t xml:space="preserve"> has accidentally imported the second header row containing </w:t>
-      </w:r>
-      <w:r>
-        <w:rPr>
-          <w:rStyle w:val="VerbatimChar"/>
-        </w:rPr>
-        <w:t>Root</w:t>
-      </w:r>
-      <w:r>
-        <w:rPr/>
-        <w:t xml:space="preserve"> or </w:t>
-      </w:r>
-      <w:r>
-        <w:rPr>
-          <w:rStyle w:val="VerbatimChar"/>
-        </w:rPr>
-        <w:t>Fruit</w:t>
-      </w:r>
-      <w:r>
-        <w:rPr/>
-        <w:t xml:space="preserve"> into the first row of data. This has confused R, which now has a mixture of text and numbers in the same data.</w:t>
-      </w:r>
-    </w:p>
-    <w:p>
-      <w:pPr>
-        <w:pStyle w:val="Heading2"/>
-        <w:rPr/>
-      </w:pPr>
-      <w:bookmarkStart w:id="62" w:name="where-have-x-and-x.1-appeared-from"/>
-      <w:r>
-        <w:rPr/>
-        <w:t>12.1 Where have X and X.1 appeared from?</w:t>
-      </w:r>
-    </w:p>
-    <w:p>
-      <w:pPr>
-        <w:pStyle w:val="FirstParagraph"/>
-        <w:rPr/>
-      </w:pPr>
-      <w:r>
-        <w:rPr/>
-        <w:t xml:space="preserve">Open your original Microsoft Excel spreadsheet (not the CSV) and look carefully at the two cells which contain </w:t>
-      </w:r>
-      <w:r>
-        <w:rPr>
-          <w:rStyle w:val="VerbatimChar"/>
-        </w:rPr>
-        <w:t>Ungrazed</w:t>
-      </w:r>
-      <w:r>
-        <w:rPr/>
-        <w:t xml:space="preserve"> and </w:t>
-      </w:r>
-      <w:r>
-        <w:rPr>
-          <w:rStyle w:val="VerbatimChar"/>
-        </w:rPr>
-        <w:t>Grazed</w:t>
-      </w:r>
-      <w:r>
-        <w:rPr/>
-        <w:t xml:space="preserve">. Notice how the width of these cells is twice that of the rows below them: they are </w:t>
-      </w:r>
-      <w:r>
-        <w:rPr>
-          <w:b/>
-          <w:bCs/>
-        </w:rPr>
-        <w:t>merged</w:t>
-      </w:r>
-      <w:r>
-        <w:rPr/>
-        <w:t xml:space="preserve"> cells. This is quite common in Microsoft Excel, but generates a column with no header when converted to CSV, which R auto-names X, X.1, X.2, X.3 etc.</w:t>
-      </w:r>
-    </w:p>
-    <w:p>
-      <w:pPr>
-        <w:pStyle w:val="BodyText"/>
-        <w:rPr/>
-      </w:pPr>
-      <w:r>
-        <w:rPr/>
-        <w:t>There are two solutions to this problem, and we’ll try both:</w:t>
+        <w:t>R and RStudio can be intimidating at first, but take your time and understand its structure. In particular:</w:t>
       </w:r>
     </w:p>
     <w:p>
@@ -10477,13 +9902,13 @@
         <w:pStyle w:val="Compact"/>
         <w:numPr>
           <w:ilvl w:val="0"/>
-          <w:numId w:val="76"/>
+          <w:numId w:val="70"/>
         </w:numPr>
         <w:rPr/>
       </w:pPr>
       <w:r>
         <w:rPr/>
-        <w:t>Restructure the data in Excel first. This is probably the simplest method for small datasets like this one.</w:t>
+        <w:t>Always use an RStudio project as it makes file management simpler. Create a separate project for each Module in your degree where you have to analyse data</w:t>
       </w:r>
     </w:p>
     <w:p>
@@ -10491,47 +9916,35 @@
         <w:pStyle w:val="Compact"/>
         <w:numPr>
           <w:ilvl w:val="0"/>
-          <w:numId w:val="77"/>
+          <w:numId w:val="71"/>
         </w:numPr>
         <w:rPr/>
       </w:pPr>
-      <w:bookmarkStart w:id="63" w:name="where-have-x-and-x.1-appeared-from"/>
-      <w:r>
-        <w:rPr/>
-        <w:t>Import into R and then restructure. This is more complicated, but is reproducible and ideal for big datasets.</w:t>
-      </w:r>
-      <w:bookmarkEnd w:id="63"/>
-    </w:p>
-    <w:p>
-      <w:pPr>
-        <w:pStyle w:val="Heading2"/>
-        <w:rPr/>
-      </w:pPr>
-      <w:bookmarkStart w:id="64" w:name="restructure-in-microsoft-excel"/>
-      <w:r>
-        <w:rPr/>
-        <w:t>12.2 Restructure in Microsoft Excel</w:t>
-      </w:r>
-    </w:p>
-    <w:p>
-      <w:pPr>
-        <w:pStyle w:val="FirstParagraph"/>
-        <w:rPr/>
-      </w:pPr>
-      <w:r>
-        <w:rPr/>
-        <w:t xml:space="preserve">Look at your .xlsx spreadsheet in Microsoft Excel, and ensure the ‘Home’ tab is selected. Make a note that the first 2 columns are Ungrazed, and the Second 2 columns are grazed. Also look at how many rows of data you have; the final set of data is on </w:t>
+      <w:r>
+        <w:rPr/>
+        <w:t xml:space="preserve">If you download Data files from the internet, you need to move them from the default </w:t>
       </w:r>
       <w:r>
         <w:rPr>
           <w:b/>
           <w:bCs/>
         </w:rPr>
-        <w:t>Row 22</w:t>
-      </w:r>
-      <w:r>
-        <w:rPr/>
-        <w:t xml:space="preserve"> so with 2 header columns you have 20 rows of data. The steps to follow are:</w:t>
+        <w:t>Downloads</w:t>
+      </w:r>
+      <w:r>
+        <w:rPr/>
+        <w:t xml:space="preserve"> folder to the project </w:t>
+      </w:r>
+      <w:r>
+        <w:rPr>
+          <w:b/>
+          <w:bCs/>
+        </w:rPr>
+        <w:t>Data</w:t>
+      </w:r>
+      <w:r>
+        <w:rPr/>
+        <w:t xml:space="preserve"> folder</w:t>
       </w:r>
     </w:p>
     <w:p>
@@ -10539,46 +9952,13 @@
         <w:pStyle w:val="Compact"/>
         <w:numPr>
           <w:ilvl w:val="0"/>
-          <w:numId w:val="78"/>
+          <w:numId w:val="72"/>
         </w:numPr>
         <w:rPr/>
       </w:pPr>
       <w:r>
         <w:rPr/>
-        <w:t xml:space="preserve">Delete the first row containing Ungrazed and Grazed by </w:t>
-      </w:r>
-      <w:r>
-        <w:rPr>
-          <w:b/>
-          <w:bCs/>
-        </w:rPr>
-        <w:t>Right-Click</w:t>
-      </w:r>
-      <w:r>
-        <w:rPr/>
-        <w:t xml:space="preserve"> on the </w:t>
-      </w:r>
-      <w:r>
-        <w:rPr>
-          <w:b/>
-          <w:bCs/>
-        </w:rPr>
-        <w:t>1</w:t>
-      </w:r>
-      <w:r>
-        <w:rPr/>
-        <w:t xml:space="preserve"> in the margin (which will highlight the entire row) and select </w:t>
-      </w:r>
-      <w:r>
-        <w:rPr>
-          <w:b/>
-          <w:bCs/>
-        </w:rPr>
-        <w:t>Delete</w:t>
-      </w:r>
-      <w:r>
-        <w:rPr/>
-        <w:t>. The first row will be deleted, and the entire set of data will move up by one row.</w:t>
+        <w:t>Remember to convert conventional Microsoft Excel files to CSV files before importing them into RStudio</w:t>
       </w:r>
     </w:p>
     <w:p>
@@ -10586,24 +9966,23 @@
         <w:pStyle w:val="Compact"/>
         <w:numPr>
           <w:ilvl w:val="0"/>
-          <w:numId w:val="79"/>
+          <w:numId w:val="73"/>
         </w:numPr>
         <w:rPr/>
       </w:pPr>
       <w:r>
         <w:rPr/>
-        <w:t xml:space="preserve">Select all the numbers (but not the headers) in Columns C and D from the Grazed treatment, and </w:t>
-      </w:r>
-      <w:r>
-        <w:rPr>
-          <w:b/>
-          <w:bCs/>
-        </w:rPr>
-        <w:t>drag</w:t>
-      </w:r>
-      <w:r>
-        <w:rPr/>
-        <w:t xml:space="preserve"> them with the mouse to be immediately below the existing data for Ungrazed.</w:t>
+        <w:t xml:space="preserve">The R “script”, </w:t>
+      </w:r>
+      <w:r>
+        <w:rPr>
+          <w:rStyle w:val="VerbatimChar"/>
+        </w:rPr>
+        <w:t>practical0.R</w:t>
+      </w:r>
+      <w:r>
+        <w:rPr/>
+        <w:t xml:space="preserve"> is all you need to save. Add lots of comments so it is easy to understand months later.</w:t>
       </w:r>
     </w:p>
     <w:p>
@@ -10611,102 +9990,37 @@
         <w:pStyle w:val="Compact"/>
         <w:numPr>
           <w:ilvl w:val="0"/>
-          <w:numId w:val="80"/>
+          <w:numId w:val="74"/>
         </w:numPr>
         <w:rPr/>
       </w:pPr>
       <w:r>
-        <w:rPr>
-          <w:b/>
-          <w:bCs/>
-        </w:rPr>
-        <w:t>Right-Click</w:t>
-      </w:r>
-      <w:r>
-        <w:rPr/>
-        <w:t xml:space="preserve"> on Column D, which highlights the whole column, and select </w:t>
-      </w:r>
-      <w:r>
-        <w:rPr>
-          <w:b/>
-          <w:bCs/>
-        </w:rPr>
-        <w:t>Delete</w:t>
-      </w:r>
-    </w:p>
-    <w:p>
-      <w:pPr>
-        <w:pStyle w:val="Compact"/>
-        <w:numPr>
-          <w:ilvl w:val="0"/>
-          <w:numId w:val="81"/>
-        </w:numPr>
-        <w:rPr/>
-      </w:pPr>
-      <w:r>
-        <w:rPr/>
-        <w:t xml:space="preserve">In Column C, change the title from “Root” to </w:t>
-      </w:r>
-      <w:r>
-        <w:rPr>
-          <w:b/>
-          <w:bCs/>
-        </w:rPr>
-        <w:t>management</w:t>
-      </w:r>
-      <w:r>
-        <w:rPr/>
-        <w:t>. I suggest you rename columns A and B from Root and Fruit to “root” and “fruit” (lower case) to avoid confusion in R.</w:t>
-      </w:r>
-    </w:p>
-    <w:p>
-      <w:pPr>
-        <w:pStyle w:val="Compact"/>
-        <w:numPr>
-          <w:ilvl w:val="0"/>
-          <w:numId w:val="82"/>
-        </w:numPr>
-        <w:rPr/>
-      </w:pPr>
-      <w:r>
-        <w:rPr/>
-        <w:t xml:space="preserve">In the management column, enter the word </w:t>
-      </w:r>
-      <w:r>
-        <w:rPr>
-          <w:b/>
-          <w:bCs/>
-        </w:rPr>
-        <w:t>ungrazed</w:t>
-      </w:r>
-      <w:r>
-        <w:rPr/>
-        <w:t xml:space="preserve"> in cell C2, and drag this down as far as cell C21; Excel will auto-fill the empty cells for you. Remember you have 20 replicates of each management treatment</w:t>
-      </w:r>
-    </w:p>
-    <w:p>
-      <w:pPr>
-        <w:pStyle w:val="Compact"/>
-        <w:numPr>
-          <w:ilvl w:val="0"/>
-          <w:numId w:val="83"/>
-        </w:numPr>
-        <w:rPr/>
-      </w:pPr>
-      <w:r>
-        <w:rPr/>
-        <w:t xml:space="preserve">In cell C22 enter the word </w:t>
-      </w:r>
-      <w:r>
-        <w:rPr>
-          <w:b/>
-          <w:bCs/>
-        </w:rPr>
-        <w:t>grazed</w:t>
-      </w:r>
-      <w:r>
-        <w:rPr/>
-        <w:t>. Double-click on the corner, and it will auto-fill to the end of the table.</w:t>
+        <w:rPr/>
+        <w:t xml:space="preserve">You can run lines sequentially from top to bottom in your </w:t>
+      </w:r>
+      <w:r>
+        <w:rPr>
+          <w:rStyle w:val="VerbatimChar"/>
+        </w:rPr>
+        <w:t>practical0.R</w:t>
+      </w:r>
+      <w:r>
+        <w:rPr/>
+        <w:t xml:space="preserve"> script to regenerate your entire workflow automatically</w:t>
+      </w:r>
+      <w:bookmarkEnd w:id="60"/>
+    </w:p>
+    <w:p>
+      <w:pPr>
+        <w:pStyle w:val="Heading1"/>
+        <w:rPr/>
+      </w:pPr>
+      <w:bookmarkStart w:id="61" w:name="__RefHeading___Toc2905_2767856350"/>
+      <w:bookmarkStart w:id="62" w:name="in-your-own-time"/>
+      <w:bookmarkEnd w:id="61"/>
+      <w:r>
+        <w:rPr/>
+        <w:t>12. In your own time</w:t>
       </w:r>
     </w:p>
     <w:p>
@@ -10716,7 +10030,7 @@
       </w:pPr>
       <w:r>
         <w:rPr/>
-        <w:t>You should see something similar to the following:</w:t>
+        <w:t>Sometimes Microsoft Excel files can look clear and attractive, but then prove difficult to use inside R. Download the ‘awkward.xlsx’ Excel file from Canvas and open it in Excel. It contains seed production weights, and the plant root sizes, under two different grazing regimes. At first sight it looks fine, with 4 columns of data for the root lengths and seed weights under the two grazing regimes:</w:t>
       </w:r>
     </w:p>
     <w:p>
@@ -10728,7 +10042,7 @@
         <w:rPr/>
         <w:drawing>
           <wp:inline distT="0" distB="0" distL="0" distR="0">
-            <wp:extent cx="4546600" cy="8026400"/>
+            <wp:extent cx="3962400" cy="6604000"/>
             <wp:effectExtent l="0" t="0" r="0" b="0"/>
             <wp:docPr id="20" name="Image20" descr=""/>
             <wp:cNvGraphicFramePr>
@@ -10752,6 +10066,832 @@
                   <pic:spPr bwMode="auto">
                     <a:xfrm>
                       <a:off x="0" y="0"/>
+                      <a:ext cx="3962400" cy="6604000"/>
+                    </a:xfrm>
+                    <a:prstGeom prst="rect">
+                      <a:avLst/>
+                    </a:prstGeom>
+                  </pic:spPr>
+                </pic:pic>
+              </a:graphicData>
+            </a:graphic>
+          </wp:inline>
+        </w:drawing>
+      </w:r>
+    </w:p>
+    <w:p>
+      <w:pPr>
+        <w:pStyle w:val="BodyText"/>
+        <w:rPr/>
+      </w:pPr>
+      <w:r>
+        <w:rPr/>
+        <w:t xml:space="preserve">As usual, export it from Excel using the ‘Save As’ option as a CSV file inside your </w:t>
+      </w:r>
+      <w:r>
+        <w:rPr>
+          <w:b/>
+          <w:bCs/>
+        </w:rPr>
+        <w:t>NES2504/Data</w:t>
+      </w:r>
+      <w:r>
+        <w:rPr/>
+        <w:t xml:space="preserve"> folder. Now add the necessary R code, to import your CSV file:</w:t>
+      </w:r>
+    </w:p>
+    <w:p>
+      <w:pPr>
+        <w:pStyle w:val="SourceCode"/>
+        <w:rPr/>
+      </w:pPr>
+      <w:r>
+        <w:rPr>
+          <w:rStyle w:val="CommentTok"/>
+        </w:rPr>
+        <w:t># Import CSV from badly structured Excel file</w:t>
+      </w:r>
+      <w:r>
+        <w:rPr/>
+        <w:br/>
+      </w:r>
+      <w:r>
+        <w:rPr>
+          <w:rStyle w:val="NormalTok"/>
+        </w:rPr>
+        <w:t xml:space="preserve">seeds_dat </w:t>
+      </w:r>
+      <w:r>
+        <w:rPr>
+          <w:rStyle w:val="OtherTok"/>
+        </w:rPr>
+        <w:t>&lt;-</w:t>
+      </w:r>
+      <w:r>
+        <w:rPr>
+          <w:rStyle w:val="NormalTok"/>
+        </w:rPr>
+        <w:t xml:space="preserve"> </w:t>
+      </w:r>
+      <w:r>
+        <w:rPr>
+          <w:rStyle w:val="FunctionTok"/>
+        </w:rPr>
+        <w:t>read.csv</w:t>
+      </w:r>
+      <w:r>
+        <w:rPr>
+          <w:rStyle w:val="NormalTok"/>
+        </w:rPr>
+        <w:t>(</w:t>
+      </w:r>
+      <w:r>
+        <w:rPr>
+          <w:rStyle w:val="StringTok"/>
+        </w:rPr>
+        <w:t>"Data/awkward.csv"</w:t>
+      </w:r>
+      <w:r>
+        <w:rPr>
+          <w:rStyle w:val="NormalTok"/>
+        </w:rPr>
+        <w:t>)</w:t>
+      </w:r>
+    </w:p>
+    <w:p>
+      <w:pPr>
+        <w:pStyle w:val="FirstParagraph"/>
+        <w:rPr/>
+      </w:pPr>
+      <w:r>
+        <w:rPr/>
+        <w:t xml:space="preserve">No errors, so presumably everything is OK? Not so fast! Add a </w:t>
+      </w:r>
+      <w:r>
+        <w:rPr>
+          <w:rStyle w:val="VerbatimChar"/>
+        </w:rPr>
+        <w:t>summary</w:t>
+      </w:r>
+      <w:r>
+        <w:rPr/>
+        <w:t xml:space="preserve"> command to have a look at your data and you’ll spot there is a problem:</w:t>
+      </w:r>
+    </w:p>
+    <w:p>
+      <w:pPr>
+        <w:pStyle w:val="SourceCode"/>
+        <w:rPr/>
+      </w:pPr>
+      <w:r>
+        <w:rPr>
+          <w:rStyle w:val="CommentTok"/>
+        </w:rPr>
+        <w:t># Import CSV from badly structured Excel file</w:t>
+      </w:r>
+      <w:r>
+        <w:rPr/>
+        <w:br/>
+      </w:r>
+      <w:r>
+        <w:rPr>
+          <w:rStyle w:val="NormalTok"/>
+        </w:rPr>
+        <w:t xml:space="preserve">seeds_dat </w:t>
+      </w:r>
+      <w:r>
+        <w:rPr>
+          <w:rStyle w:val="OtherTok"/>
+        </w:rPr>
+        <w:t>&lt;-</w:t>
+      </w:r>
+      <w:r>
+        <w:rPr>
+          <w:rStyle w:val="NormalTok"/>
+        </w:rPr>
+        <w:t xml:space="preserve"> </w:t>
+      </w:r>
+      <w:r>
+        <w:rPr>
+          <w:rStyle w:val="FunctionTok"/>
+        </w:rPr>
+        <w:t>read.csv</w:t>
+      </w:r>
+      <w:r>
+        <w:rPr>
+          <w:rStyle w:val="NormalTok"/>
+        </w:rPr>
+        <w:t>(</w:t>
+      </w:r>
+      <w:r>
+        <w:rPr>
+          <w:rStyle w:val="StringTok"/>
+        </w:rPr>
+        <w:t>"Data/awkward.csv"</w:t>
+      </w:r>
+      <w:r>
+        <w:rPr>
+          <w:rStyle w:val="NormalTok"/>
+        </w:rPr>
+        <w:t>)</w:t>
+      </w:r>
+      <w:r>
+        <w:rPr/>
+        <w:br/>
+        <w:br/>
+      </w:r>
+      <w:r>
+        <w:rPr>
+          <w:rStyle w:val="CommentTok"/>
+        </w:rPr>
+        <w:t># Check data format with summary</w:t>
+      </w:r>
+      <w:r>
+        <w:rPr/>
+        <w:br/>
+      </w:r>
+      <w:r>
+        <w:rPr>
+          <w:rStyle w:val="FunctionTok"/>
+        </w:rPr>
+        <w:t>summary</w:t>
+      </w:r>
+      <w:r>
+        <w:rPr>
+          <w:rStyle w:val="NormalTok"/>
+        </w:rPr>
+        <w:t>(seeds_dat)</w:t>
+      </w:r>
+    </w:p>
+    <w:p>
+      <w:pPr>
+        <w:pStyle w:val="SourceCode"/>
+        <w:rPr/>
+      </w:pPr>
+      <w:r>
+        <w:rPr>
+          <w:rStyle w:val="VerbatimChar"/>
+        </w:rPr>
+        <w:t xml:space="preserve">      </w:t>
+      </w:r>
+      <w:r>
+        <w:rPr>
+          <w:rStyle w:val="VerbatimChar"/>
+        </w:rPr>
+        <w:t xml:space="preserve">Ungrazed          X            Grazed          X.1    </w:t>
+      </w:r>
+      <w:r>
+        <w:rPr/>
+        <w:br/>
+      </w:r>
+      <w:r>
+        <w:rPr>
+          <w:rStyle w:val="VerbatimChar"/>
+        </w:rPr>
+        <w:t xml:space="preserve"> Length   :21   Length   :21   Length   :21   Length   :21  </w:t>
+      </w:r>
+      <w:r>
+        <w:rPr/>
+        <w:br/>
+      </w:r>
+      <w:r>
+        <w:rPr>
+          <w:rStyle w:val="VerbatimChar"/>
+        </w:rPr>
+        <w:t xml:space="preserve"> N.unique :21   N.unique :21   N.unique :21   N.unique :21  </w:t>
+      </w:r>
+      <w:r>
+        <w:rPr/>
+        <w:br/>
+      </w:r>
+      <w:r>
+        <w:rPr>
+          <w:rStyle w:val="VerbatimChar"/>
+        </w:rPr>
+        <w:t xml:space="preserve"> N.blank  : 0   N.blank  : 0   N.blank  : 0   N.blank  : 0  </w:t>
+      </w:r>
+      <w:r>
+        <w:rPr/>
+        <w:br/>
+      </w:r>
+      <w:r>
+        <w:rPr>
+          <w:rStyle w:val="VerbatimChar"/>
+        </w:rPr>
+        <w:t xml:space="preserve"> Min.nchar: 4   Min.nchar: 5   Min.nchar: 4   Min.nchar: 4  </w:t>
+      </w:r>
+      <w:r>
+        <w:rPr/>
+        <w:br/>
+      </w:r>
+      <w:r>
+        <w:rPr>
+          <w:rStyle w:val="VerbatimChar"/>
+        </w:rPr>
+        <w:t xml:space="preserve"> Max.nchar: 5   Max.nchar: 5   Max.nchar: 6   Max.nchar: 6  </w:t>
+      </w:r>
+    </w:p>
+    <w:p>
+      <w:pPr>
+        <w:pStyle w:val="FirstParagraph"/>
+        <w:rPr/>
+      </w:pPr>
+      <w:r>
+        <w:rPr/>
+        <w:t xml:space="preserve">You seem to have gained 2 mysterious columns called </w:t>
+      </w:r>
+      <w:r>
+        <w:rPr>
+          <w:b/>
+          <w:bCs/>
+        </w:rPr>
+        <w:t>X</w:t>
+      </w:r>
+      <w:r>
+        <w:rPr/>
+        <w:t xml:space="preserve"> and </w:t>
+      </w:r>
+      <w:r>
+        <w:rPr>
+          <w:b/>
+          <w:bCs/>
+        </w:rPr>
+        <w:t>X.2</w:t>
+      </w:r>
+      <w:r>
+        <w:rPr/>
+        <w:t xml:space="preserve"> which aren’t in the original dataset, and there is no indication of which columns are </w:t>
+      </w:r>
+      <w:r>
+        <w:rPr>
+          <w:rStyle w:val="VerbatimChar"/>
+        </w:rPr>
+        <w:t>Root</w:t>
+      </w:r>
+      <w:r>
+        <w:rPr/>
+        <w:t xml:space="preserve"> or </w:t>
+      </w:r>
+      <w:r>
+        <w:rPr>
+          <w:rStyle w:val="VerbatimChar"/>
+        </w:rPr>
+        <w:t>Fruit</w:t>
+      </w:r>
+      <w:r>
+        <w:rPr/>
+        <w:t xml:space="preserve">. Also look carefully at the </w:t>
+      </w:r>
+      <w:r>
+        <w:rPr>
+          <w:rStyle w:val="VerbatimChar"/>
+        </w:rPr>
+        <w:t>summary()</w:t>
+      </w:r>
+      <w:r>
+        <w:rPr/>
+        <w:t xml:space="preserve"> results: there are no means, medians, min, or max etc. as you would expect. What has gone wrong? Let’s look at the first few lines using the </w:t>
+      </w:r>
+      <w:r>
+        <w:rPr>
+          <w:rStyle w:val="VerbatimChar"/>
+        </w:rPr>
+        <w:t>head()</w:t>
+      </w:r>
+      <w:r>
+        <w:rPr/>
+        <w:t xml:space="preserve"> function:</w:t>
+      </w:r>
+    </w:p>
+    <w:p>
+      <w:pPr>
+        <w:pStyle w:val="SourceCode"/>
+        <w:rPr/>
+      </w:pPr>
+      <w:r>
+        <w:rPr>
+          <w:rStyle w:val="FunctionTok"/>
+        </w:rPr>
+        <w:t>head</w:t>
+      </w:r>
+      <w:r>
+        <w:rPr>
+          <w:rStyle w:val="NormalTok"/>
+        </w:rPr>
+        <w:t>(seeds_dat)</w:t>
+      </w:r>
+    </w:p>
+    <w:p>
+      <w:pPr>
+        <w:pStyle w:val="SourceCode"/>
+        <w:rPr/>
+      </w:pPr>
+      <w:r>
+        <w:rPr>
+          <w:rStyle w:val="VerbatimChar"/>
+        </w:rPr>
+        <w:t xml:space="preserve">  </w:t>
+      </w:r>
+      <w:r>
+        <w:rPr>
+          <w:rStyle w:val="VerbatimChar"/>
+        </w:rPr>
+        <w:t>Ungrazed     X Grazed    X.1</w:t>
+      </w:r>
+      <w:r>
+        <w:rPr/>
+        <w:br/>
+      </w:r>
+      <w:r>
+        <w:rPr>
+          <w:rStyle w:val="VerbatimChar"/>
+        </w:rPr>
+        <w:t>1     Root Fruit   Root  Fruit</w:t>
+      </w:r>
+      <w:r>
+        <w:rPr/>
+        <w:br/>
+      </w:r>
+      <w:r>
+        <w:rPr>
+          <w:rStyle w:val="VerbatimChar"/>
+        </w:rPr>
+        <w:t>2    6.225 59.77 10.253 116.05</w:t>
+      </w:r>
+      <w:r>
+        <w:rPr/>
+        <w:br/>
+      </w:r>
+      <w:r>
+        <w:rPr>
+          <w:rStyle w:val="VerbatimChar"/>
+        </w:rPr>
+        <w:t>3    6.487 60.98  6.958  38.94</w:t>
+      </w:r>
+      <w:r>
+        <w:rPr/>
+        <w:br/>
+      </w:r>
+      <w:r>
+        <w:rPr>
+          <w:rStyle w:val="VerbatimChar"/>
+        </w:rPr>
+        <w:t>4    4.919 14.73  8.001  60.77</w:t>
+      </w:r>
+      <w:r>
+        <w:rPr/>
+        <w:br/>
+      </w:r>
+      <w:r>
+        <w:rPr>
+          <w:rStyle w:val="VerbatimChar"/>
+        </w:rPr>
+        <w:t>5     5.13 19.28  9.039  84.37</w:t>
+      </w:r>
+      <w:r>
+        <w:rPr/>
+        <w:br/>
+      </w:r>
+      <w:r>
+        <w:rPr>
+          <w:rStyle w:val="VerbatimChar"/>
+        </w:rPr>
+        <w:t>6    5.417 34.25   8.91  70.11</w:t>
+      </w:r>
+    </w:p>
+    <w:p>
+      <w:pPr>
+        <w:pStyle w:val="FirstParagraph"/>
+        <w:rPr/>
+      </w:pPr>
+      <w:r>
+        <w:rPr/>
+        <w:t xml:space="preserve">Now the problem is clear. There were of course </w:t>
+      </w:r>
+      <w:r>
+        <w:rPr>
+          <w:b/>
+          <w:bCs/>
+        </w:rPr>
+        <w:t>two</w:t>
+      </w:r>
+      <w:r>
+        <w:rPr/>
+        <w:t xml:space="preserve"> header rows in your Excel file; the </w:t>
+      </w:r>
+      <w:r>
+        <w:rPr>
+          <w:rStyle w:val="VerbatimChar"/>
+        </w:rPr>
+        <w:t>read.csv()</w:t>
+      </w:r>
+      <w:r>
+        <w:rPr/>
+        <w:t xml:space="preserve"> has accidentally imported the second header row containing </w:t>
+      </w:r>
+      <w:r>
+        <w:rPr>
+          <w:rStyle w:val="VerbatimChar"/>
+        </w:rPr>
+        <w:t>Root</w:t>
+      </w:r>
+      <w:r>
+        <w:rPr/>
+        <w:t xml:space="preserve"> or </w:t>
+      </w:r>
+      <w:r>
+        <w:rPr>
+          <w:rStyle w:val="VerbatimChar"/>
+        </w:rPr>
+        <w:t>Fruit</w:t>
+      </w:r>
+      <w:r>
+        <w:rPr/>
+        <w:t xml:space="preserve"> into the first row of data. This has confused R, which now has a mixture of text and numbers in the same data.</w:t>
+      </w:r>
+    </w:p>
+    <w:p>
+      <w:pPr>
+        <w:pStyle w:val="Heading2"/>
+        <w:rPr/>
+      </w:pPr>
+      <w:bookmarkStart w:id="63" w:name="where-have-x-and-x.1-appeared-from"/>
+      <w:r>
+        <w:rPr/>
+        <w:t>12.1 Where have X and X.1 appeared from?</w:t>
+      </w:r>
+    </w:p>
+    <w:p>
+      <w:pPr>
+        <w:pStyle w:val="FirstParagraph"/>
+        <w:rPr/>
+      </w:pPr>
+      <w:r>
+        <w:rPr/>
+        <w:t xml:space="preserve">Open your original Microsoft Excel spreadsheet (not the CSV) and look carefully at the two cells which contain </w:t>
+      </w:r>
+      <w:r>
+        <w:rPr>
+          <w:rStyle w:val="VerbatimChar"/>
+        </w:rPr>
+        <w:t>Ungrazed</w:t>
+      </w:r>
+      <w:r>
+        <w:rPr/>
+        <w:t xml:space="preserve"> and </w:t>
+      </w:r>
+      <w:r>
+        <w:rPr>
+          <w:rStyle w:val="VerbatimChar"/>
+        </w:rPr>
+        <w:t>Grazed</w:t>
+      </w:r>
+      <w:r>
+        <w:rPr/>
+        <w:t xml:space="preserve">. Notice how the width of these cells is twice that of the rows below them: they are </w:t>
+      </w:r>
+      <w:r>
+        <w:rPr>
+          <w:b/>
+          <w:bCs/>
+        </w:rPr>
+        <w:t>merged</w:t>
+      </w:r>
+      <w:r>
+        <w:rPr/>
+        <w:t xml:space="preserve"> cells. This is quite common in Microsoft Excel, but generates a column with no header when converted to CSV, which R auto-names X, X.1, X.2, X.3 etc.</w:t>
+      </w:r>
+    </w:p>
+    <w:p>
+      <w:pPr>
+        <w:pStyle w:val="BodyText"/>
+        <w:rPr/>
+      </w:pPr>
+      <w:r>
+        <w:rPr/>
+        <w:t>There are two solutions to this problem, and we’ll try both:</w:t>
+      </w:r>
+    </w:p>
+    <w:p>
+      <w:pPr>
+        <w:pStyle w:val="Compact"/>
+        <w:numPr>
+          <w:ilvl w:val="0"/>
+          <w:numId w:val="75"/>
+        </w:numPr>
+        <w:rPr/>
+      </w:pPr>
+      <w:r>
+        <w:rPr/>
+        <w:t>Restructure the data in Excel first. This is probably the simplest method for small datasets like this one.</w:t>
+      </w:r>
+    </w:p>
+    <w:p>
+      <w:pPr>
+        <w:pStyle w:val="Compact"/>
+        <w:numPr>
+          <w:ilvl w:val="0"/>
+          <w:numId w:val="76"/>
+        </w:numPr>
+        <w:rPr/>
+      </w:pPr>
+      <w:bookmarkStart w:id="64" w:name="where-have-x-and-x.1-appeared-from"/>
+      <w:r>
+        <w:rPr/>
+        <w:t>Import into R and then restructure. This is more complicated, but is reproducible and ideal for big datasets.</w:t>
+      </w:r>
+      <w:bookmarkEnd w:id="64"/>
+    </w:p>
+    <w:p>
+      <w:pPr>
+        <w:pStyle w:val="Heading2"/>
+        <w:rPr/>
+      </w:pPr>
+      <w:bookmarkStart w:id="65" w:name="restructure-in-microsoft-excel"/>
+      <w:r>
+        <w:rPr/>
+        <w:t>12.2 Restructure in Microsoft Excel</w:t>
+      </w:r>
+    </w:p>
+    <w:p>
+      <w:pPr>
+        <w:pStyle w:val="FirstParagraph"/>
+        <w:rPr/>
+      </w:pPr>
+      <w:r>
+        <w:rPr/>
+        <w:t xml:space="preserve">Look at your .xlsx spreadsheet in Microsoft Excel, and ensure the ‘Home’ tab is selected. Make a note that the first 2 columns are Ungrazed, and the Second 2 columns are grazed. Also look at how many rows of data you have; the final set of data is on </w:t>
+      </w:r>
+      <w:r>
+        <w:rPr>
+          <w:b/>
+          <w:bCs/>
+        </w:rPr>
+        <w:t>Row 22</w:t>
+      </w:r>
+      <w:r>
+        <w:rPr/>
+        <w:t xml:space="preserve"> so with 2 header columns you have 20 rows of data. The steps to follow are:</w:t>
+      </w:r>
+    </w:p>
+    <w:p>
+      <w:pPr>
+        <w:pStyle w:val="Compact"/>
+        <w:numPr>
+          <w:ilvl w:val="0"/>
+          <w:numId w:val="77"/>
+        </w:numPr>
+        <w:rPr/>
+      </w:pPr>
+      <w:r>
+        <w:rPr/>
+        <w:t xml:space="preserve">Delete the first row containing Ungrazed and Grazed by </w:t>
+      </w:r>
+      <w:r>
+        <w:rPr>
+          <w:b/>
+          <w:bCs/>
+        </w:rPr>
+        <w:t>Right-Click</w:t>
+      </w:r>
+      <w:r>
+        <w:rPr/>
+        <w:t xml:space="preserve"> on the </w:t>
+      </w:r>
+      <w:r>
+        <w:rPr>
+          <w:b/>
+          <w:bCs/>
+        </w:rPr>
+        <w:t>1</w:t>
+      </w:r>
+      <w:r>
+        <w:rPr/>
+        <w:t xml:space="preserve"> in the margin (which will highlight the entire row) and select </w:t>
+      </w:r>
+      <w:r>
+        <w:rPr>
+          <w:b/>
+          <w:bCs/>
+        </w:rPr>
+        <w:t>Delete</w:t>
+      </w:r>
+      <w:r>
+        <w:rPr/>
+        <w:t>. The first row will be deleted, and the entire set of data will move up by one row.</w:t>
+      </w:r>
+    </w:p>
+    <w:p>
+      <w:pPr>
+        <w:pStyle w:val="Compact"/>
+        <w:numPr>
+          <w:ilvl w:val="0"/>
+          <w:numId w:val="78"/>
+        </w:numPr>
+        <w:rPr/>
+      </w:pPr>
+      <w:r>
+        <w:rPr/>
+        <w:t xml:space="preserve">Select all the numbers (but not the headers) in Columns C and D from the Grazed treatment, and </w:t>
+      </w:r>
+      <w:r>
+        <w:rPr>
+          <w:b/>
+          <w:bCs/>
+        </w:rPr>
+        <w:t>drag</w:t>
+      </w:r>
+      <w:r>
+        <w:rPr/>
+        <w:t xml:space="preserve"> them with the mouse to be immediately below the existing data for Ungrazed.</w:t>
+      </w:r>
+    </w:p>
+    <w:p>
+      <w:pPr>
+        <w:pStyle w:val="Compact"/>
+        <w:numPr>
+          <w:ilvl w:val="0"/>
+          <w:numId w:val="79"/>
+        </w:numPr>
+        <w:rPr/>
+      </w:pPr>
+      <w:r>
+        <w:rPr>
+          <w:b/>
+          <w:bCs/>
+        </w:rPr>
+        <w:t>Right-Click</w:t>
+      </w:r>
+      <w:r>
+        <w:rPr/>
+        <w:t xml:space="preserve"> on Column D, which highlights the whole column, and select </w:t>
+      </w:r>
+      <w:r>
+        <w:rPr>
+          <w:b/>
+          <w:bCs/>
+        </w:rPr>
+        <w:t>Delete</w:t>
+      </w:r>
+    </w:p>
+    <w:p>
+      <w:pPr>
+        <w:pStyle w:val="Compact"/>
+        <w:numPr>
+          <w:ilvl w:val="0"/>
+          <w:numId w:val="80"/>
+        </w:numPr>
+        <w:rPr/>
+      </w:pPr>
+      <w:r>
+        <w:rPr/>
+        <w:t xml:space="preserve">In Column C, change the title from “Root” to </w:t>
+      </w:r>
+      <w:r>
+        <w:rPr>
+          <w:b/>
+          <w:bCs/>
+        </w:rPr>
+        <w:t>management</w:t>
+      </w:r>
+      <w:r>
+        <w:rPr/>
+        <w:t>. I suggest you rename columns A and B from Root and Fruit to “root” and “fruit” (lower case) to avoid confusion in R.</w:t>
+      </w:r>
+    </w:p>
+    <w:p>
+      <w:pPr>
+        <w:pStyle w:val="Compact"/>
+        <w:numPr>
+          <w:ilvl w:val="0"/>
+          <w:numId w:val="81"/>
+        </w:numPr>
+        <w:rPr/>
+      </w:pPr>
+      <w:r>
+        <w:rPr/>
+        <w:t xml:space="preserve">In the management column, enter the word </w:t>
+      </w:r>
+      <w:r>
+        <w:rPr>
+          <w:b/>
+          <w:bCs/>
+        </w:rPr>
+        <w:t>ungrazed</w:t>
+      </w:r>
+      <w:r>
+        <w:rPr/>
+        <w:t xml:space="preserve"> in cell C2, and drag this down as far as cell C21; Excel will auto-fill the empty cells for you. Remember you have 20 replicates of each management treatment</w:t>
+      </w:r>
+    </w:p>
+    <w:p>
+      <w:pPr>
+        <w:pStyle w:val="Compact"/>
+        <w:numPr>
+          <w:ilvl w:val="0"/>
+          <w:numId w:val="82"/>
+        </w:numPr>
+        <w:rPr/>
+      </w:pPr>
+      <w:r>
+        <w:rPr/>
+        <w:t xml:space="preserve">In cell C22 enter the word </w:t>
+      </w:r>
+      <w:r>
+        <w:rPr>
+          <w:b/>
+          <w:bCs/>
+        </w:rPr>
+        <w:t>grazed</w:t>
+      </w:r>
+      <w:r>
+        <w:rPr/>
+        <w:t>. Double-click on the corner, and it will auto-fill to the end of the table.</w:t>
+      </w:r>
+    </w:p>
+    <w:p>
+      <w:pPr>
+        <w:pStyle w:val="FirstParagraph"/>
+        <w:rPr/>
+      </w:pPr>
+      <w:r>
+        <w:rPr/>
+        <w:t>You should see something similar to the following:</w:t>
+      </w:r>
+    </w:p>
+    <w:p>
+      <w:pPr>
+        <w:pStyle w:val="BodyText"/>
+        <w:rPr/>
+      </w:pPr>
+      <w:r>
+        <w:rPr/>
+        <w:drawing>
+          <wp:inline distT="0" distB="0" distL="0" distR="0">
+            <wp:extent cx="4546600" cy="8026400"/>
+            <wp:effectExtent l="0" t="0" r="0" b="0"/>
+            <wp:docPr id="21" name="Image21" descr=""/>
+            <wp:cNvGraphicFramePr>
+              <a:graphicFrameLocks xmlns:a="http://schemas.openxmlformats.org/drawingml/2006/main" noChangeAspect="1"/>
+            </wp:cNvGraphicFramePr>
+            <a:graphic xmlns:a="http://schemas.openxmlformats.org/drawingml/2006/main">
+              <a:graphicData uri="http://schemas.openxmlformats.org/drawingml/2006/picture">
+                <pic:pic xmlns:pic="http://schemas.openxmlformats.org/drawingml/2006/picture">
+                  <pic:nvPicPr>
+                    <pic:cNvPr id="21" name="Image21" descr=""/>
+                    <pic:cNvPicPr>
+                      <a:picLocks noChangeAspect="1" noChangeArrowheads="1"/>
+                    </pic:cNvPicPr>
+                  </pic:nvPicPr>
+                  <pic:blipFill>
+                    <a:blip r:embed="rId25"/>
+                    <a:stretch>
+                      <a:fillRect/>
+                    </a:stretch>
+                  </pic:blipFill>
+                  <pic:spPr bwMode="auto">
+                    <a:xfrm>
+                      <a:off x="0" y="0"/>
                       <a:ext cx="4546600" cy="8026400"/>
                     </a:xfrm>
                     <a:prstGeom prst="rect">
@@ -11129,14 +11269,14 @@
         <w:rPr/>
         <w:t xml:space="preserve"> as numeric.</w:t>
       </w:r>
-      <w:bookmarkEnd w:id="64"/>
+      <w:bookmarkEnd w:id="65"/>
     </w:p>
     <w:p>
       <w:pPr>
         <w:pStyle w:val="Heading2"/>
         <w:rPr/>
       </w:pPr>
-      <w:bookmarkStart w:id="65" w:name="restructure-in-rstudio"/>
+      <w:bookmarkStart w:id="66" w:name="restructure-in-rstudio"/>
       <w:r>
         <w:rPr/>
         <w:t>12.3 Restructure in RStudio</w:t>
@@ -12065,17 +12205,17 @@
         <w:spacing w:before="180" w:after="180"/>
         <w:rPr/>
       </w:pPr>
-      <w:bookmarkStart w:id="66" w:name="in-your-own-time"/>
-      <w:bookmarkStart w:id="67" w:name="restructure-in-rstudio"/>
+      <w:bookmarkStart w:id="67" w:name="in-your-own-time"/>
+      <w:bookmarkStart w:id="68" w:name="restructure-in-rstudio"/>
       <w:r>
         <w:rPr/>
         <w:t>Again you can see clean output. Whilst there is more R code, it is easier to do long-term as it is more reproducible, and especially with big Excel spreadsheets avoids errors due to mis-placed cut and paste.</w:t>
       </w:r>
-      <w:bookmarkEnd w:id="66"/>
       <w:bookmarkEnd w:id="67"/>
+      <w:bookmarkEnd w:id="68"/>
     </w:p>
     <w:sectPr>
-      <w:footerReference w:type="default" r:id="rId25"/>
+      <w:footerReference w:type="default" r:id="rId26"/>
       <w:type w:val="nextPage"/>
       <w:pgSz w:w="12240" w:h="15840"/>
       <w:pgMar w:left="1440" w:right="1440" w:gutter="0" w:header="0" w:top="1440" w:footer="1440" w:bottom="2203"/>
@@ -12097,7 +12237,7 @@
       <w:jc w:val="center"/>
       <w:rPr/>
     </w:pPr>
-    <w:bookmarkStart w:id="68" w:name="PageNumWizard_FOOTER_Default_Page_Style1"/>
+    <w:bookmarkStart w:id="69" w:name="PageNumWizard_FOOTER_Default_Page_Style1"/>
     <w:r>
       <w:rPr/>
       <w:fldChar w:fldCharType="begin"/>
@@ -12112,13 +12252,13 @@
     </w:r>
     <w:r>
       <w:rPr/>
-      <w:t>43</w:t>
+      <w:t>44</w:t>
     </w:r>
     <w:r>
       <w:rPr/>
       <w:fldChar w:fldCharType="end"/>
     </w:r>
-    <w:bookmarkEnd w:id="68"/>
+    <w:bookmarkEnd w:id="69"/>
   </w:p>
 </w:ftr>
 </file>
@@ -14884,16 +15024,16 @@
     <w:abstractNumId w:val="2"/>
   </w:num>
   <w:num w:numId="75">
-    <w:abstractNumId w:val="2"/>
-  </w:num>
-  <w:num w:numId="76">
     <w:abstractNumId w:val="1"/>
     <w:lvlOverride w:ilvl="0">
       <w:startOverride w:val="1"/>
     </w:lvlOverride>
   </w:num>
+  <w:num w:numId="76">
+    <w:abstractNumId w:val="1"/>
+  </w:num>
   <w:num w:numId="77">
-    <w:abstractNumId w:val="1"/>
+    <w:abstractNumId w:val="2"/>
   </w:num>
   <w:num w:numId="78">
     <w:abstractNumId w:val="2"/>
@@ -14908,9 +15048,6 @@
     <w:abstractNumId w:val="2"/>
   </w:num>
   <w:num w:numId="82">
-    <w:abstractNumId w:val="2"/>
-  </w:num>
-  <w:num w:numId="83">
     <w:abstractNumId w:val="2"/>
   </w:num>
 </w:numbering>

</xml_diff>